<commit_message>
feat(news): auto-detect and render URLs in news content
</commit_message>
<xml_diff>
--- a/Docs/Bitácora_Copilot_ arquitectura_y_razonamiento.docx
+++ b/Docs/Bitácora_Copilot_ arquitectura_y_razonamiento.docx
@@ -153,21 +153,7 @@
           <w:rPr>
             <w:rStyle w:val="Hipervnculo"/>
           </w:rPr>
-          <w:t>[</w:t>
-        </w:r>
-        <w:proofErr w:type="spellStart"/>
-        <w:r>
-          <w:rPr>
-            <w:rStyle w:val="Hipervnculo"/>
-          </w:rPr>
-          <w:t>Fablab_acc</w:t>
-        </w:r>
-        <w:proofErr w:type="spellEnd"/>
-        <w:r>
-          <w:rPr>
-            <w:rStyle w:val="Hipervnculo"/>
-          </w:rPr>
-          <w:t>..._Funcional | Word]</w:t>
+          <w:t>[Fablab_acc..._Funcional | Word]</w:t>
         </w:r>
       </w:hyperlink>
       <w:r>
@@ -178,21 +164,7 @@
           <w:rPr>
             <w:rStyle w:val="Hipervnculo"/>
           </w:rPr>
-          <w:t>[</w:t>
-        </w:r>
-        <w:proofErr w:type="spellStart"/>
-        <w:r>
-          <w:rPr>
-            <w:rStyle w:val="Hipervnculo"/>
-          </w:rPr>
-          <w:t>inacapmail</w:t>
-        </w:r>
-        <w:proofErr w:type="spellEnd"/>
-        <w:r>
-          <w:rPr>
-            <w:rStyle w:val="Hipervnculo"/>
-          </w:rPr>
-          <w:t>...epoint.com]</w:t>
+          <w:t>[inacapmail...epoint.com]</w:t>
         </w:r>
       </w:hyperlink>
     </w:p>
@@ -301,13 +273,8 @@
         <w:t>──</w:t>
       </w:r>
       <w:r>
-        <w:t xml:space="preserve"> </w:t>
-      </w:r>
-      <w:proofErr w:type="spellStart"/>
-      <w:r>
-        <w:t>Gestor_Docente</w:t>
-      </w:r>
-      <w:proofErr w:type="spellEnd"/>
+        <w:t xml:space="preserve"> Gestor_Docente</w:t>
+      </w:r>
     </w:p>
     <w:p>
       <w:r>
@@ -323,13 +290,8 @@
         <w:t>──</w:t>
       </w:r>
       <w:r>
-        <w:t xml:space="preserve"> </w:t>
-      </w:r>
-      <w:proofErr w:type="spellStart"/>
-      <w:r>
-        <w:t>FABLAB_Access</w:t>
-      </w:r>
-      <w:proofErr w:type="spellEnd"/>
+        <w:t xml:space="preserve"> FABLAB_Access</w:t>
+      </w:r>
     </w:p>
     <w:p>
       <w:r>
@@ -338,11 +300,9 @@
     </w:p>
     <w:p/>
     <w:p>
-      <w:proofErr w:type="spellStart"/>
       <w:r>
         <w:t>Vercel</w:t>
       </w:r>
-      <w:proofErr w:type="spellEnd"/>
     </w:p>
     <w:p>
       <w:r>
@@ -363,13 +323,8 @@
         <w:t>──</w:t>
       </w:r>
       <w:r>
-        <w:t xml:space="preserve"> </w:t>
-      </w:r>
-      <w:proofErr w:type="spellStart"/>
-      <w:r>
-        <w:t>Gestor_Docente</w:t>
-      </w:r>
-      <w:proofErr w:type="spellEnd"/>
+        <w:t xml:space="preserve"> Gestor_Docente</w:t>
+      </w:r>
     </w:p>
     <w:p>
       <w:r>
@@ -385,13 +340,8 @@
         <w:t>──</w:t>
       </w:r>
       <w:r>
-        <w:t xml:space="preserve"> </w:t>
-      </w:r>
-      <w:proofErr w:type="spellStart"/>
-      <w:r>
-        <w:t>FABLAB_Access</w:t>
-      </w:r>
-      <w:proofErr w:type="spellEnd"/>
+        <w:t xml:space="preserve"> FABLAB_Access</w:t>
+      </w:r>
     </w:p>
     <w:p>
       <w:r>
@@ -400,11 +350,9 @@
     </w:p>
     <w:p/>
     <w:p>
-      <w:proofErr w:type="spellStart"/>
       <w:r>
         <w:t>Supabase</w:t>
       </w:r>
-      <w:proofErr w:type="spellEnd"/>
     </w:p>
     <w:p>
       <w:r>
@@ -425,13 +373,8 @@
         <w:t>──</w:t>
       </w:r>
       <w:r>
-        <w:t xml:space="preserve"> </w:t>
-      </w:r>
-      <w:proofErr w:type="spellStart"/>
-      <w:r>
-        <w:t>Gestor_Docente</w:t>
-      </w:r>
-      <w:proofErr w:type="spellEnd"/>
+        <w:t xml:space="preserve"> Gestor_Docente</w:t>
+      </w:r>
     </w:p>
     <w:p>
       <w:r>
@@ -447,13 +390,8 @@
         <w:t>──</w:t>
       </w:r>
       <w:r>
-        <w:t xml:space="preserve"> </w:t>
-      </w:r>
-      <w:proofErr w:type="spellStart"/>
-      <w:r>
-        <w:t>FABLAB_Access</w:t>
-      </w:r>
-      <w:proofErr w:type="spellEnd"/>
+        <w:t xml:space="preserve"> FABLAB_Access</w:t>
+      </w:r>
     </w:p>
     <w:p>
       <w:r>
@@ -706,11 +644,9 @@
       </w:r>
     </w:p>
     <w:p>
-      <w:proofErr w:type="spellStart"/>
       <w:r>
         <w:t>Dashboard</w:t>
       </w:r>
-      <w:proofErr w:type="spellEnd"/>
     </w:p>
     <w:p>
       <w:r>
@@ -1000,17 +936,8 @@
           <w:b/>
           <w:bCs/>
         </w:rPr>
-        <w:t xml:space="preserve">Infraestructura </w:t>
-      </w:r>
-      <w:proofErr w:type="spellStart"/>
-      <w:r>
-        <w:rPr>
-          <w:b/>
-          <w:bCs/>
-        </w:rPr>
-        <w:t>React</w:t>
-      </w:r>
-      <w:proofErr w:type="spellEnd"/>
+        <w:t>Infraestructura React</w:t>
+      </w:r>
     </w:p>
     <w:p>
       <w:r>
@@ -1024,13 +951,8 @@
     </w:p>
     <w:p>
       <w:r>
-        <w:t xml:space="preserve">└── </w:t>
-      </w:r>
-      <w:proofErr w:type="spellStart"/>
-      <w:r>
-        <w:t>React_App</w:t>
-      </w:r>
-      <w:proofErr w:type="spellEnd"/>
+        <w:t>└── React_App</w:t>
+      </w:r>
     </w:p>
     <w:p>
       <w:r>
@@ -1044,11 +966,9 @@
           <w:numId w:val="3"/>
         </w:numPr>
       </w:pPr>
-      <w:proofErr w:type="spellStart"/>
       <w:r>
         <w:t>React</w:t>
       </w:r>
-      <w:proofErr w:type="spellEnd"/>
     </w:p>
     <w:p>
       <w:pPr>
@@ -1068,11 +988,9 @@
           <w:numId w:val="3"/>
         </w:numPr>
       </w:pPr>
-      <w:proofErr w:type="spellStart"/>
       <w:r>
         <w:t>Supabase</w:t>
       </w:r>
-      <w:proofErr w:type="spellEnd"/>
     </w:p>
     <w:p>
       <w:pPr>
@@ -1092,11 +1010,9 @@
           <w:numId w:val="3"/>
         </w:numPr>
       </w:pPr>
-      <w:proofErr w:type="spellStart"/>
       <w:r>
         <w:t>Vercel</w:t>
       </w:r>
-      <w:proofErr w:type="spellEnd"/>
     </w:p>
     <w:p>
       <w:r>
@@ -1131,33 +1047,15 @@
       </w:r>
     </w:p>
     <w:p>
-      <w:proofErr w:type="spellStart"/>
       <w:r>
         <w:lastRenderedPageBreak/>
-        <w:t>react</w:t>
-      </w:r>
-      <w:proofErr w:type="spellEnd"/>
-      <w:r>
-        <w:t>-</w:t>
-      </w:r>
-      <w:proofErr w:type="spellStart"/>
-      <w:r>
-        <w:t>router</w:t>
-      </w:r>
-      <w:proofErr w:type="spellEnd"/>
-      <w:r>
-        <w:t>-dom</w:t>
-      </w:r>
-    </w:p>
-    <w:p>
-      <w:r>
-        <w:t>lucide-</w:t>
-      </w:r>
-      <w:proofErr w:type="spellStart"/>
-      <w:r>
-        <w:t>react</w:t>
-      </w:r>
-      <w:proofErr w:type="spellEnd"/>
+        <w:t>react-router-dom</w:t>
+      </w:r>
+    </w:p>
+    <w:p>
+      <w:r>
+        <w:t>lucide-react</w:t>
+      </w:r>
     </w:p>
     <w:p>
       <w:r>
@@ -1183,15 +1081,7 @@
         <w:t>✅</w:t>
       </w:r>
       <w:r>
-        <w:t xml:space="preserve"> </w:t>
-      </w:r>
-      <w:proofErr w:type="spellStart"/>
-      <w:r>
-        <w:t>Build</w:t>
-      </w:r>
-      <w:proofErr w:type="spellEnd"/>
-      <w:r>
-        <w:t xml:space="preserve"> funcional.</w:t>
+        <w:t xml:space="preserve"> Build funcional.</w:t>
       </w:r>
     </w:p>
     <w:p>
@@ -1437,26 +1327,20 @@
       </w:r>
     </w:p>
     <w:p>
-      <w:proofErr w:type="spellStart"/>
       <w:r>
         <w:lastRenderedPageBreak/>
         <w:t>ProjectCard</w:t>
       </w:r>
-      <w:proofErr w:type="spellEnd"/>
-    </w:p>
-    <w:p>
-      <w:proofErr w:type="spellStart"/>
+    </w:p>
+    <w:p>
       <w:r>
         <w:t>CommunitySection</w:t>
       </w:r>
-      <w:proofErr w:type="spellEnd"/>
-    </w:p>
-    <w:p>
-      <w:proofErr w:type="spellStart"/>
+    </w:p>
+    <w:p>
       <w:r>
         <w:t>SiteFooter</w:t>
       </w:r>
-      <w:proofErr w:type="spellEnd"/>
     </w:p>
     <w:p>
       <w:r>
@@ -1515,17 +1399,8 @@
           <w:b/>
           <w:bCs/>
         </w:rPr>
-        <w:t xml:space="preserve">Preparación de </w:t>
-      </w:r>
-      <w:proofErr w:type="spellStart"/>
-      <w:r>
-        <w:rPr>
-          <w:b/>
-          <w:bCs/>
-        </w:rPr>
-        <w:t>Supabase</w:t>
-      </w:r>
-      <w:proofErr w:type="spellEnd"/>
+        <w:t>Preparación de Supabase</w:t>
+      </w:r>
     </w:p>
     <w:p>
       <w:r>
@@ -1539,7 +1414,6 @@
           <w:bCs/>
         </w:rPr>
       </w:pPr>
-      <w:proofErr w:type="spellStart"/>
       <w:r>
         <w:rPr>
           <w:b/>
@@ -1547,7 +1421,6 @@
         </w:rPr>
         <w:t>projects</w:t>
       </w:r>
-      <w:proofErr w:type="spellEnd"/>
     </w:p>
     <w:p>
       <w:r>
@@ -1555,76 +1428,57 @@
       </w:r>
     </w:p>
     <w:p>
-      <w:proofErr w:type="spellStart"/>
       <w:r>
         <w:t>title</w:t>
       </w:r>
-      <w:proofErr w:type="spellEnd"/>
-    </w:p>
-    <w:p>
-      <w:proofErr w:type="spellStart"/>
+    </w:p>
+    <w:p>
       <w:r>
         <w:t>summary</w:t>
       </w:r>
-      <w:proofErr w:type="spellEnd"/>
-    </w:p>
-    <w:p>
-      <w:proofErr w:type="gramStart"/>
+    </w:p>
+    <w:p>
       <w:r>
         <w:t>status</w:t>
       </w:r>
-      <w:proofErr w:type="gramEnd"/>
-    </w:p>
-    <w:p>
-      <w:proofErr w:type="spellStart"/>
+    </w:p>
+    <w:p>
       <w:r>
         <w:t>year</w:t>
       </w:r>
-      <w:proofErr w:type="spellEnd"/>
-    </w:p>
-    <w:p>
-      <w:proofErr w:type="spellStart"/>
+    </w:p>
+    <w:p>
       <w:r>
         <w:t>image_url</w:t>
       </w:r>
-      <w:proofErr w:type="spellEnd"/>
-    </w:p>
-    <w:p>
-      <w:proofErr w:type="spellStart"/>
+    </w:p>
+    <w:p>
       <w:r>
         <w:t>video_url</w:t>
       </w:r>
-      <w:proofErr w:type="spellEnd"/>
-    </w:p>
-    <w:p>
-      <w:proofErr w:type="spellStart"/>
+    </w:p>
+    <w:p>
       <w:r>
         <w:t>open_sam_url</w:t>
       </w:r>
-      <w:proofErr w:type="spellEnd"/>
-    </w:p>
-    <w:p>
-      <w:proofErr w:type="spellStart"/>
+    </w:p>
+    <w:p>
       <w:r>
         <w:t>featured</w:t>
       </w:r>
-      <w:proofErr w:type="spellEnd"/>
-    </w:p>
-    <w:p>
-      <w:proofErr w:type="spellStart"/>
+    </w:p>
+    <w:p>
       <w:r>
         <w:t>created_at</w:t>
       </w:r>
-      <w:proofErr w:type="spellEnd"/>
-    </w:p>
-    <w:p>
-      <w:pPr>
-        <w:rPr>
-          <w:b/>
-          <w:bCs/>
-        </w:rPr>
-      </w:pPr>
-      <w:proofErr w:type="spellStart"/>
+    </w:p>
+    <w:p>
+      <w:pPr>
+        <w:rPr>
+          <w:b/>
+          <w:bCs/>
+        </w:rPr>
+      </w:pPr>
       <w:r>
         <w:rPr>
           <w:b/>
@@ -1632,7 +1486,6 @@
         </w:rPr>
         <w:t>news</w:t>
       </w:r>
-      <w:proofErr w:type="spellEnd"/>
     </w:p>
     <w:p>
       <w:r>
@@ -1640,55 +1493,42 @@
       </w:r>
     </w:p>
     <w:p>
-      <w:proofErr w:type="spellStart"/>
       <w:r>
         <w:t>title</w:t>
       </w:r>
-      <w:proofErr w:type="spellEnd"/>
-    </w:p>
-    <w:p>
-      <w:proofErr w:type="spellStart"/>
+    </w:p>
+    <w:p>
       <w:r>
         <w:t>summary</w:t>
       </w:r>
-      <w:proofErr w:type="spellEnd"/>
-    </w:p>
-    <w:p>
-      <w:proofErr w:type="spellStart"/>
+    </w:p>
+    <w:p>
       <w:r>
         <w:t>content</w:t>
       </w:r>
-      <w:proofErr w:type="spellEnd"/>
-    </w:p>
-    <w:p>
-      <w:proofErr w:type="spellStart"/>
+    </w:p>
+    <w:p>
       <w:r>
         <w:t>image_url</w:t>
       </w:r>
-      <w:proofErr w:type="spellEnd"/>
-    </w:p>
-    <w:p>
-      <w:proofErr w:type="spellStart"/>
+    </w:p>
+    <w:p>
       <w:r>
         <w:t>published</w:t>
       </w:r>
-      <w:proofErr w:type="spellEnd"/>
-    </w:p>
-    <w:p>
-      <w:proofErr w:type="spellStart"/>
+    </w:p>
+    <w:p>
       <w:r>
         <w:t>created_at</w:t>
       </w:r>
-      <w:proofErr w:type="spellEnd"/>
-    </w:p>
-    <w:p>
-      <w:pPr>
-        <w:rPr>
-          <w:b/>
-          <w:bCs/>
-        </w:rPr>
-      </w:pPr>
-      <w:proofErr w:type="spellStart"/>
+    </w:p>
+    <w:p>
+      <w:pPr>
+        <w:rPr>
+          <w:b/>
+          <w:bCs/>
+        </w:rPr>
+      </w:pPr>
       <w:r>
         <w:rPr>
           <w:b/>
@@ -1697,7 +1537,6 @@
         <w:lastRenderedPageBreak/>
         <w:t>admin_users</w:t>
       </w:r>
-      <w:proofErr w:type="spellEnd"/>
     </w:p>
     <w:p>
       <w:r>
@@ -1720,20 +1559,17 @@
       </w:r>
     </w:p>
     <w:p>
-      <w:proofErr w:type="spellStart"/>
       <w:r>
         <w:t>created_at</w:t>
       </w:r>
-      <w:proofErr w:type="spellEnd"/>
-    </w:p>
-    <w:p>
-      <w:pPr>
-        <w:rPr>
-          <w:b/>
-          <w:bCs/>
-        </w:rPr>
-      </w:pPr>
-      <w:proofErr w:type="spellStart"/>
+    </w:p>
+    <w:p>
+      <w:pPr>
+        <w:rPr>
+          <w:b/>
+          <w:bCs/>
+        </w:rPr>
+      </w:pPr>
       <w:r>
         <w:rPr>
           <w:b/>
@@ -1741,7 +1577,6 @@
         </w:rPr>
         <w:t>settings</w:t>
       </w:r>
-      <w:proofErr w:type="spellEnd"/>
     </w:p>
     <w:p>
       <w:r>
@@ -1749,25 +1584,19 @@
       </w:r>
     </w:p>
     <w:p>
-      <w:proofErr w:type="spellStart"/>
       <w:r>
         <w:t>fablab_name</w:t>
       </w:r>
-      <w:proofErr w:type="spellEnd"/>
-    </w:p>
-    <w:p>
-      <w:proofErr w:type="spellStart"/>
+    </w:p>
+    <w:p>
       <w:r>
         <w:t>contact_email</w:t>
       </w:r>
-      <w:proofErr w:type="spellEnd"/>
-    </w:p>
-    <w:p>
-      <w:proofErr w:type="spellStart"/>
+    </w:p>
+    <w:p>
       <w:r>
         <w:t>created_at</w:t>
       </w:r>
-      <w:proofErr w:type="spellEnd"/>
     </w:p>
     <w:p>
       <w:r>
@@ -1793,15 +1622,7 @@
         <w:t>✅</w:t>
       </w:r>
       <w:r>
-        <w:t xml:space="preserve"> Compatibilidad con </w:t>
-      </w:r>
-      <w:proofErr w:type="spellStart"/>
-      <w:r>
-        <w:t>Supabase</w:t>
-      </w:r>
-      <w:proofErr w:type="spellEnd"/>
-      <w:r>
-        <w:t>.</w:t>
+        <w:t xml:space="preserve"> Compatibilidad con Supabase.</w:t>
       </w:r>
     </w:p>
     <w:p>
@@ -1863,13 +1684,8 @@
       </w:r>
     </w:p>
     <w:p>
-      <w:proofErr w:type="spellStart"/>
-      <w:r>
-        <w:t>Supabase</w:t>
-      </w:r>
-      <w:proofErr w:type="spellEnd"/>
-      <w:r>
-        <w:t xml:space="preserve"> Storage</w:t>
+      <w:r>
+        <w:t>Supabase Storage</w:t>
       </w:r>
     </w:p>
     <w:p>
@@ -1919,11 +1735,9 @@
       </w:r>
     </w:p>
     <w:p>
-      <w:proofErr w:type="spellStart"/>
       <w:r>
         <w:t>video_url</w:t>
       </w:r>
-      <w:proofErr w:type="spellEnd"/>
     </w:p>
     <w:p>
       <w:r>
@@ -2031,15 +1845,7 @@
         <w:t>✅</w:t>
       </w:r>
       <w:r>
-        <w:t xml:space="preserve"> </w:t>
-      </w:r>
-      <w:proofErr w:type="spellStart"/>
-      <w:r>
-        <w:t>React</w:t>
-      </w:r>
-      <w:proofErr w:type="spellEnd"/>
-      <w:r>
-        <w:t xml:space="preserve"> + Vite configurado.</w:t>
+        <w:t xml:space="preserve"> React + Vite configurado.</w:t>
       </w:r>
     </w:p>
     <w:p>
@@ -2160,34 +1966,18 @@
         <w:t>✅</w:t>
       </w:r>
       <w:r>
-        <w:t xml:space="preserve"> Cliente </w:t>
-      </w:r>
-      <w:proofErr w:type="spellStart"/>
-      <w:r>
-        <w:t>Supabase</w:t>
-      </w:r>
-      <w:proofErr w:type="spellEnd"/>
-      <w:r>
-        <w:t xml:space="preserve"> preparado.</w:t>
-      </w:r>
-    </w:p>
-    <w:p>
-      <w:r>
-        <w:rPr>
-          <w:rFonts w:ascii="Segoe UI Emoji" w:hAnsi="Segoe UI Emoji" w:cs="Segoe UI Emoji"/>
-        </w:rPr>
-        <w:t>✅</w:t>
-      </w:r>
-      <w:r>
-        <w:t xml:space="preserve"> </w:t>
-      </w:r>
-      <w:proofErr w:type="spellStart"/>
-      <w:r>
-        <w:t>Build</w:t>
-      </w:r>
-      <w:proofErr w:type="spellEnd"/>
-      <w:r>
-        <w:t xml:space="preserve"> exitoso.</w:t>
+        <w:t xml:space="preserve"> Cliente Supabase preparado.</w:t>
+      </w:r>
+    </w:p>
+    <w:p>
+      <w:r>
+        <w:rPr>
+          <w:rFonts w:ascii="Segoe UI Emoji" w:hAnsi="Segoe UI Emoji" w:cs="Segoe UI Emoji"/>
+        </w:rPr>
+        <w:t>✅</w:t>
+      </w:r>
+      <w:r>
+        <w:t xml:space="preserve"> Build exitoso.</w:t>
       </w:r>
     </w:p>
     <w:p>
@@ -2231,15 +2021,7 @@
         <w:t>🔲</w:t>
       </w:r>
       <w:r>
-        <w:t xml:space="preserve"> Integrar datos reales desde </w:t>
-      </w:r>
-      <w:proofErr w:type="spellStart"/>
-      <w:r>
-        <w:t>Supabase</w:t>
-      </w:r>
-      <w:proofErr w:type="spellEnd"/>
-      <w:r>
-        <w:t>.</w:t>
+        <w:t xml:space="preserve"> Integrar datos reales desde Supabase.</w:t>
       </w:r>
     </w:p>
     <w:p>
@@ -2284,15 +2066,7 @@
         <w:t>🔲</w:t>
       </w:r>
       <w:r>
-        <w:t xml:space="preserve"> Construir </w:t>
-      </w:r>
-      <w:proofErr w:type="spellStart"/>
-      <w:r>
-        <w:t>Dashboard</w:t>
-      </w:r>
-      <w:proofErr w:type="spellEnd"/>
-      <w:r>
-        <w:t xml:space="preserve"> administrativo.</w:t>
+        <w:t xml:space="preserve"> Construir Dashboard administrativo.</w:t>
       </w:r>
     </w:p>
     <w:p>
@@ -2314,15 +2088,7 @@
         <w:t>🔲</w:t>
       </w:r>
       <w:r>
-        <w:t xml:space="preserve"> Publicar MVP en </w:t>
-      </w:r>
-      <w:proofErr w:type="spellStart"/>
-      <w:r>
-        <w:t>Vercel</w:t>
-      </w:r>
-      <w:proofErr w:type="spellEnd"/>
-      <w:r>
-        <w:t>.</w:t>
+        <w:t xml:space="preserve"> Publicar MVP en Vercel.</w:t>
       </w:r>
     </w:p>
     <w:p>
@@ -2420,7 +2186,6 @@
       <w:r>
         <w:t xml:space="preserve"> y la infraestructura de </w:t>
       </w:r>
-      <w:proofErr w:type="spellStart"/>
       <w:r>
         <w:rPr>
           <w:b/>
@@ -2428,7 +2193,6 @@
         </w:rPr>
         <w:t>Supabase</w:t>
       </w:r>
-      <w:proofErr w:type="spellEnd"/>
       <w:r>
         <w:t xml:space="preserve">, incorporando persistencia real de datos, almacenamiento multimedia y administración privada de contenidos. </w:t>
       </w:r>
@@ -2437,43 +2201,7 @@
           <w:rPr>
             <w:rStyle w:val="Hipervnculo"/>
           </w:rPr>
-          <w:t>[</w:t>
-        </w:r>
-        <w:proofErr w:type="spellStart"/>
-        <w:r>
-          <w:rPr>
-            <w:rStyle w:val="Hipervnculo"/>
-          </w:rPr>
-          <w:t>Bitácora_</w:t>
-        </w:r>
-        <w:proofErr w:type="gramStart"/>
-        <w:r>
-          <w:rPr>
-            <w:rStyle w:val="Hipervnculo"/>
-          </w:rPr>
-          <w:t>C</w:t>
-        </w:r>
-        <w:proofErr w:type="spellEnd"/>
-        <w:r>
-          <w:rPr>
-            <w:rStyle w:val="Hipervnculo"/>
-          </w:rPr>
-          <w:t>...</w:t>
-        </w:r>
-        <w:proofErr w:type="spellStart"/>
-        <w:proofErr w:type="gramEnd"/>
-        <w:r>
-          <w:rPr>
-            <w:rStyle w:val="Hipervnculo"/>
-          </w:rPr>
-          <w:t>zonamiento</w:t>
-        </w:r>
-        <w:proofErr w:type="spellEnd"/>
-        <w:r>
-          <w:rPr>
-            <w:rStyle w:val="Hipervnculo"/>
-          </w:rPr>
-          <w:t xml:space="preserve"> | Word]</w:t>
+          <w:t>[Bitácora_C...zonamiento | Word]</w:t>
         </w:r>
       </w:hyperlink>
     </w:p>
@@ -2486,43 +2214,7 @@
           <w:rPr>
             <w:rStyle w:val="Hipervnculo"/>
           </w:rPr>
-          <w:t>[</w:t>
-        </w:r>
-        <w:proofErr w:type="spellStart"/>
-        <w:r>
-          <w:rPr>
-            <w:rStyle w:val="Hipervnculo"/>
-          </w:rPr>
-          <w:t>Bitácora_</w:t>
-        </w:r>
-        <w:proofErr w:type="gramStart"/>
-        <w:r>
-          <w:rPr>
-            <w:rStyle w:val="Hipervnculo"/>
-          </w:rPr>
-          <w:t>C</w:t>
-        </w:r>
-        <w:proofErr w:type="spellEnd"/>
-        <w:r>
-          <w:rPr>
-            <w:rStyle w:val="Hipervnculo"/>
-          </w:rPr>
-          <w:t>...</w:t>
-        </w:r>
-        <w:proofErr w:type="spellStart"/>
-        <w:proofErr w:type="gramEnd"/>
-        <w:r>
-          <w:rPr>
-            <w:rStyle w:val="Hipervnculo"/>
-          </w:rPr>
-          <w:t>zonamiento</w:t>
-        </w:r>
-        <w:proofErr w:type="spellEnd"/>
-        <w:r>
-          <w:rPr>
-            <w:rStyle w:val="Hipervnculo"/>
-          </w:rPr>
-          <w:t xml:space="preserve"> | Word]</w:t>
+          <w:t>[Bitácora_C...zonamiento | Word]</w:t>
         </w:r>
       </w:hyperlink>
     </w:p>
@@ -2545,72 +2237,19 @@
           <w:b/>
           <w:bCs/>
         </w:rPr>
-        <w:t xml:space="preserve">Integración de </w:t>
-      </w:r>
-      <w:proofErr w:type="spellStart"/>
-      <w:r>
-        <w:rPr>
-          <w:b/>
-          <w:bCs/>
-        </w:rPr>
-        <w:t>Supabase</w:t>
-      </w:r>
-      <w:proofErr w:type="spellEnd"/>
-    </w:p>
-    <w:p>
-      <w:r>
-        <w:t xml:space="preserve">Se definió utilizar una única instancia de </w:t>
-      </w:r>
-      <w:proofErr w:type="spellStart"/>
-      <w:r>
-        <w:t>Supabase</w:t>
-      </w:r>
-      <w:proofErr w:type="spellEnd"/>
-      <w:r>
-        <w:t xml:space="preserve"> compartida con otros servicios del laboratorio, manteniendo separación lógica mediante tablas independientes. Esta decisión permitió reducir complejidad operativa y costos de mantenimiento sin afectar la autonomía del portal. </w:t>
+        <w:t>Integración de Supabase</w:t>
+      </w:r>
+    </w:p>
+    <w:p>
+      <w:r>
+        <w:t xml:space="preserve">Se definió utilizar una única instancia de Supabase compartida con otros servicios del laboratorio, manteniendo separación lógica mediante tablas independientes. Esta decisión permitió reducir complejidad operativa y costos de mantenimiento sin afectar la autonomía del portal. </w:t>
       </w:r>
       <w:hyperlink r:id="rId9" w:history="1">
         <w:r>
           <w:rPr>
             <w:rStyle w:val="Hipervnculo"/>
           </w:rPr>
-          <w:t>[</w:t>
-        </w:r>
-        <w:proofErr w:type="spellStart"/>
-        <w:r>
-          <w:rPr>
-            <w:rStyle w:val="Hipervnculo"/>
-          </w:rPr>
-          <w:t>Bitácora_</w:t>
-        </w:r>
-        <w:proofErr w:type="gramStart"/>
-        <w:r>
-          <w:rPr>
-            <w:rStyle w:val="Hipervnculo"/>
-          </w:rPr>
-          <w:t>C</w:t>
-        </w:r>
-        <w:proofErr w:type="spellEnd"/>
-        <w:r>
-          <w:rPr>
-            <w:rStyle w:val="Hipervnculo"/>
-          </w:rPr>
-          <w:t>...</w:t>
-        </w:r>
-        <w:proofErr w:type="spellStart"/>
-        <w:proofErr w:type="gramEnd"/>
-        <w:r>
-          <w:rPr>
-            <w:rStyle w:val="Hipervnculo"/>
-          </w:rPr>
-          <w:t>zonamiento</w:t>
-        </w:r>
-        <w:proofErr w:type="spellEnd"/>
-        <w:r>
-          <w:rPr>
-            <w:rStyle w:val="Hipervnculo"/>
-          </w:rPr>
-          <w:t xml:space="preserve"> | Word]</w:t>
+          <w:t>[Bitácora_C...zonamiento | Word]</w:t>
         </w:r>
       </w:hyperlink>
     </w:p>
@@ -2620,7 +2259,6 @@
       </w:r>
     </w:p>
     <w:p>
-      <w:proofErr w:type="spellStart"/>
       <w:r>
         <w:rPr>
           <w:b/>
@@ -2629,7 +2267,6 @@
         <w:lastRenderedPageBreak/>
         <w:t>projects</w:t>
       </w:r>
-      <w:proofErr w:type="spellEnd"/>
     </w:p>
     <w:p>
       <w:r>
@@ -2654,11 +2291,9 @@
           <w:numId w:val="8"/>
         </w:numPr>
       </w:pPr>
-      <w:proofErr w:type="spellStart"/>
       <w:r>
         <w:t>title</w:t>
       </w:r>
-      <w:proofErr w:type="spellEnd"/>
     </w:p>
     <w:p>
       <w:pPr>
@@ -2667,11 +2302,9 @@
           <w:numId w:val="8"/>
         </w:numPr>
       </w:pPr>
-      <w:proofErr w:type="spellStart"/>
       <w:r>
         <w:t>summary</w:t>
       </w:r>
-      <w:proofErr w:type="spellEnd"/>
     </w:p>
     <w:p>
       <w:pPr>
@@ -2680,11 +2313,9 @@
           <w:numId w:val="8"/>
         </w:numPr>
       </w:pPr>
-      <w:proofErr w:type="spellStart"/>
       <w:r>
         <w:t>description</w:t>
       </w:r>
-      <w:proofErr w:type="spellEnd"/>
     </w:p>
     <w:p>
       <w:pPr>
@@ -2693,11 +2324,9 @@
           <w:numId w:val="8"/>
         </w:numPr>
       </w:pPr>
-      <w:proofErr w:type="spellStart"/>
       <w:r>
         <w:t>category</w:t>
       </w:r>
-      <w:proofErr w:type="spellEnd"/>
     </w:p>
     <w:p>
       <w:pPr>
@@ -2706,11 +2335,9 @@
           <w:numId w:val="8"/>
         </w:numPr>
       </w:pPr>
-      <w:proofErr w:type="spellStart"/>
       <w:r>
         <w:t>year</w:t>
       </w:r>
-      <w:proofErr w:type="spellEnd"/>
     </w:p>
     <w:p>
       <w:pPr>
@@ -2719,11 +2346,9 @@
           <w:numId w:val="8"/>
         </w:numPr>
       </w:pPr>
-      <w:proofErr w:type="spellStart"/>
       <w:r>
         <w:t>image_url</w:t>
       </w:r>
-      <w:proofErr w:type="spellEnd"/>
     </w:p>
     <w:p>
       <w:pPr>
@@ -2732,11 +2357,9 @@
           <w:numId w:val="8"/>
         </w:numPr>
       </w:pPr>
-      <w:proofErr w:type="spellStart"/>
       <w:r>
         <w:t>video_url</w:t>
       </w:r>
-      <w:proofErr w:type="spellEnd"/>
     </w:p>
     <w:p>
       <w:pPr>
@@ -2745,11 +2368,9 @@
           <w:numId w:val="8"/>
         </w:numPr>
       </w:pPr>
-      <w:proofErr w:type="spellStart"/>
       <w:r>
         <w:t>open_sam_url</w:t>
       </w:r>
-      <w:proofErr w:type="spellEnd"/>
     </w:p>
     <w:p>
       <w:pPr>
@@ -2758,11 +2379,9 @@
           <w:numId w:val="8"/>
         </w:numPr>
       </w:pPr>
-      <w:proofErr w:type="spellStart"/>
       <w:r>
         <w:t>featured</w:t>
       </w:r>
-      <w:proofErr w:type="spellEnd"/>
     </w:p>
     <w:p>
       <w:pPr>
@@ -2771,11 +2390,9 @@
           <w:numId w:val="8"/>
         </w:numPr>
       </w:pPr>
-      <w:proofErr w:type="spellStart"/>
       <w:r>
         <w:t>published</w:t>
       </w:r>
-      <w:proofErr w:type="spellEnd"/>
     </w:p>
     <w:p>
       <w:pPr>
@@ -2784,11 +2401,9 @@
           <w:numId w:val="8"/>
         </w:numPr>
       </w:pPr>
-      <w:proofErr w:type="spellStart"/>
       <w:r>
         <w:t>created_at</w:t>
       </w:r>
-      <w:proofErr w:type="spellEnd"/>
     </w:p>
     <w:p>
       <w:r>
@@ -2874,15 +2489,7 @@
     </w:p>
     <w:p>
       <w:r>
-        <w:t xml:space="preserve">El catálogo público dejó de utilizar datos de prueba y pasó a consumir datos reales desde </w:t>
-      </w:r>
-      <w:proofErr w:type="spellStart"/>
-      <w:r>
-        <w:t>Supabase</w:t>
-      </w:r>
-      <w:proofErr w:type="spellEnd"/>
-      <w:r>
-        <w:t>.</w:t>
+        <w:t>El catálogo público dejó de utilizar datos de prueba y pasó a consumir datos reales desde Supabase.</w:t>
       </w:r>
     </w:p>
     <w:p>
@@ -3025,29 +2632,8 @@
     </w:p>
     <w:p>
       <w:r>
-        <w:t xml:space="preserve">Public can </w:t>
-      </w:r>
-      <w:proofErr w:type="spellStart"/>
-      <w:r>
-        <w:t>read</w:t>
-      </w:r>
-      <w:proofErr w:type="spellEnd"/>
-      <w:r>
-        <w:t xml:space="preserve"> </w:t>
-      </w:r>
-      <w:proofErr w:type="spellStart"/>
-      <w:r>
-        <w:t>published</w:t>
-      </w:r>
-      <w:proofErr w:type="spellEnd"/>
-      <w:r>
-        <w:t xml:space="preserve"> </w:t>
-      </w:r>
-      <w:proofErr w:type="spellStart"/>
-      <w:r>
-        <w:t>projects</w:t>
-      </w:r>
-      <w:proofErr w:type="spellEnd"/>
+        <w:t>Public can read published projects</w:t>
+      </w:r>
     </w:p>
     <w:p>
       <w:r>
@@ -3070,96 +2656,24 @@
       </w:r>
     </w:p>
     <w:p>
-      <w:proofErr w:type="spellStart"/>
-      <w:r>
-        <w:t>Admins</w:t>
-      </w:r>
-      <w:proofErr w:type="spellEnd"/>
-      <w:r>
-        <w:t xml:space="preserve"> can </w:t>
-      </w:r>
-      <w:proofErr w:type="spellStart"/>
-      <w:r>
-        <w:t>read</w:t>
-      </w:r>
-      <w:proofErr w:type="spellEnd"/>
-      <w:r>
-        <w:t xml:space="preserve"> </w:t>
-      </w:r>
-      <w:proofErr w:type="spellStart"/>
-      <w:r>
-        <w:t>projects</w:t>
-      </w:r>
-      <w:proofErr w:type="spellEnd"/>
-    </w:p>
-    <w:p>
-      <w:proofErr w:type="spellStart"/>
-      <w:r>
-        <w:t>Admins</w:t>
-      </w:r>
-      <w:proofErr w:type="spellEnd"/>
-      <w:r>
-        <w:t xml:space="preserve"> can </w:t>
-      </w:r>
-      <w:proofErr w:type="spellStart"/>
-      <w:r>
-        <w:t>insert</w:t>
-      </w:r>
-      <w:proofErr w:type="spellEnd"/>
-      <w:r>
-        <w:t xml:space="preserve"> </w:t>
-      </w:r>
-      <w:proofErr w:type="spellStart"/>
-      <w:r>
-        <w:t>projects</w:t>
-      </w:r>
-      <w:proofErr w:type="spellEnd"/>
-    </w:p>
-    <w:p>
-      <w:proofErr w:type="spellStart"/>
-      <w:r>
-        <w:t>Admins</w:t>
-      </w:r>
-      <w:proofErr w:type="spellEnd"/>
-      <w:r>
-        <w:t xml:space="preserve"> can </w:t>
-      </w:r>
-      <w:proofErr w:type="spellStart"/>
-      <w:r>
-        <w:t>update</w:t>
-      </w:r>
-      <w:proofErr w:type="spellEnd"/>
-      <w:r>
-        <w:t xml:space="preserve"> </w:t>
-      </w:r>
-      <w:proofErr w:type="spellStart"/>
-      <w:r>
-        <w:t>projects</w:t>
-      </w:r>
-      <w:proofErr w:type="spellEnd"/>
-    </w:p>
-    <w:p>
-      <w:proofErr w:type="spellStart"/>
-      <w:r>
-        <w:t>Admins</w:t>
-      </w:r>
-      <w:proofErr w:type="spellEnd"/>
-      <w:r>
-        <w:t xml:space="preserve"> can </w:t>
-      </w:r>
-      <w:proofErr w:type="spellStart"/>
-      <w:r>
-        <w:t>delete</w:t>
-      </w:r>
-      <w:proofErr w:type="spellEnd"/>
-      <w:r>
-        <w:t xml:space="preserve"> </w:t>
-      </w:r>
-      <w:proofErr w:type="spellStart"/>
-      <w:r>
-        <w:t>projects</w:t>
-      </w:r>
-      <w:proofErr w:type="spellEnd"/>
+      <w:r>
+        <w:t>Admins can read projects</w:t>
+      </w:r>
+    </w:p>
+    <w:p>
+      <w:r>
+        <w:t>Admins can insert projects</w:t>
+      </w:r>
+    </w:p>
+    <w:p>
+      <w:r>
+        <w:t>Admins can update projects</w:t>
+      </w:r>
+    </w:p>
+    <w:p>
+      <w:r>
+        <w:t>Admins can delete projects</w:t>
+      </w:r>
     </w:p>
     <w:p>
       <w:r>
@@ -3223,19 +2737,10 @@
     </w:p>
     <w:p>
       <w:r>
-        <w:t xml:space="preserve">Se creó el </w:t>
-      </w:r>
-      <w:proofErr w:type="spellStart"/>
-      <w:r>
-        <w:t>bucket</w:t>
-      </w:r>
-      <w:proofErr w:type="spellEnd"/>
-      <w:r>
-        <w:t xml:space="preserve"> público:</w:t>
-      </w:r>
-    </w:p>
-    <w:p>
-      <w:proofErr w:type="spellStart"/>
+        <w:t>Se creó el bucket público:</w:t>
+      </w:r>
+    </w:p>
+    <w:p>
       <w:r>
         <w:rPr>
           <w:b/>
@@ -3243,7 +2748,6 @@
         </w:rPr>
         <w:t>projects</w:t>
       </w:r>
-      <w:proofErr w:type="spellEnd"/>
     </w:p>
     <w:p>
       <w:r>
@@ -3251,13 +2755,8 @@
       </w:r>
     </w:p>
     <w:p>
-      <w:proofErr w:type="spellStart"/>
-      <w:r>
-        <w:t>Supabase</w:t>
-      </w:r>
-      <w:proofErr w:type="spellEnd"/>
-      <w:r>
-        <w:t xml:space="preserve"> Storage</w:t>
+      <w:r>
+        <w:t>Supabase Storage</w:t>
       </w:r>
     </w:p>
     <w:p>
@@ -3284,15 +2783,7 @@
         <w:t>✅</w:t>
       </w:r>
       <w:r>
-        <w:t xml:space="preserve"> </w:t>
-      </w:r>
-      <w:proofErr w:type="spellStart"/>
-      <w:r>
-        <w:t>Bucket</w:t>
-      </w:r>
-      <w:proofErr w:type="spellEnd"/>
-      <w:r>
-        <w:t xml:space="preserve"> operativo.</w:t>
+        <w:t xml:space="preserve"> Bucket operativo.</w:t>
       </w:r>
     </w:p>
     <w:p>
@@ -3314,39 +2805,18 @@
         <w:t>✅</w:t>
       </w:r>
       <w:r>
-        <w:t xml:space="preserve"> Generación de </w:t>
-      </w:r>
-      <w:proofErr w:type="spellStart"/>
-      <w:r>
-        <w:t>URLs</w:t>
-      </w:r>
-      <w:proofErr w:type="spellEnd"/>
-      <w:r>
-        <w:t xml:space="preserve"> públicas.</w:t>
-      </w:r>
-    </w:p>
-    <w:p>
-      <w:r>
-        <w:rPr>
-          <w:rFonts w:ascii="Segoe UI Emoji" w:hAnsi="Segoe UI Emoji" w:cs="Segoe UI Emoji"/>
-        </w:rPr>
-        <w:t>✅</w:t>
-      </w:r>
-      <w:r>
-        <w:t xml:space="preserve"> Compatibilidad con </w:t>
-      </w:r>
-      <w:proofErr w:type="spellStart"/>
-      <w:proofErr w:type="gramStart"/>
-      <w:r>
-        <w:t>projects.image</w:t>
-      </w:r>
-      <w:proofErr w:type="gramEnd"/>
-      <w:r>
-        <w:t>_url</w:t>
-      </w:r>
-      <w:proofErr w:type="spellEnd"/>
-      <w:r>
-        <w:t>.</w:t>
+        <w:t xml:space="preserve"> Generación de URLs públicas.</w:t>
+      </w:r>
+    </w:p>
+    <w:p>
+      <w:r>
+        <w:rPr>
+          <w:rFonts w:ascii="Segoe UI Emoji" w:hAnsi="Segoe UI Emoji" w:cs="Segoe UI Emoji"/>
+        </w:rPr>
+        <w:t>✅</w:t>
+      </w:r>
+      <w:r>
+        <w:t xml:space="preserve"> Compatibilidad con projects.image_url.</w:t>
       </w:r>
     </w:p>
     <w:p>
@@ -3383,13 +2853,8 @@
     </w:p>
     <w:p>
       <w:r>
-        <w:t>/</w:t>
-      </w:r>
-      <w:proofErr w:type="spellStart"/>
-      <w:r>
-        <w:t>admin</w:t>
-      </w:r>
-      <w:proofErr w:type="spellEnd"/>
+        <w:t>/admin</w:t>
+      </w:r>
     </w:p>
     <w:p>
       <w:r>
@@ -3397,29 +2862,8 @@
       </w:r>
     </w:p>
     <w:p>
-      <w:proofErr w:type="spellStart"/>
-      <w:r>
-        <w:t>Supabase</w:t>
-      </w:r>
-      <w:proofErr w:type="spellEnd"/>
-      <w:r>
-        <w:t xml:space="preserve"> Auth ↓ </w:t>
-      </w:r>
-      <w:proofErr w:type="spellStart"/>
-      <w:r>
-        <w:t>admin_users</w:t>
-      </w:r>
-      <w:proofErr w:type="spellEnd"/>
-      <w:r>
-        <w:t xml:space="preserve"> ↓ Validación de acceso ↓ </w:t>
-      </w:r>
-      <w:proofErr w:type="spellStart"/>
-      <w:r>
-        <w:t>Dashboard</w:t>
-      </w:r>
-      <w:proofErr w:type="spellEnd"/>
-      <w:r>
-        <w:t xml:space="preserve"> privado</w:t>
+      <w:r>
+        <w:t>Supabase Auth ↓ admin_users ↓ Validación de acceso ↓ Dashboard privado</w:t>
       </w:r>
     </w:p>
     <w:p>
@@ -3457,15 +2901,7 @@
         <w:t>✅</w:t>
       </w:r>
       <w:r>
-        <w:t xml:space="preserve"> Validación mediante tabla </w:t>
-      </w:r>
-      <w:proofErr w:type="spellStart"/>
-      <w:r>
-        <w:t>admin_users</w:t>
-      </w:r>
-      <w:proofErr w:type="spellEnd"/>
-      <w:r>
-        <w:t>.</w:t>
+        <w:t xml:space="preserve"> Validación mediante tabla admin_users.</w:t>
       </w:r>
     </w:p>
     <w:p>
@@ -3487,15 +2923,7 @@
         <w:t>✅</w:t>
       </w:r>
       <w:r>
-        <w:t xml:space="preserve"> </w:t>
-      </w:r>
-      <w:proofErr w:type="spellStart"/>
-      <w:r>
-        <w:t>Dashboard</w:t>
-      </w:r>
-      <w:proofErr w:type="spellEnd"/>
-      <w:r>
-        <w:t xml:space="preserve"> administrativo.</w:t>
+        <w:t xml:space="preserve"> Dashboard administrativo.</w:t>
       </w:r>
     </w:p>
     <w:p>
@@ -3517,9 +2945,15 @@
           <w:b/>
           <w:bCs/>
         </w:rPr>
-        <w:t xml:space="preserve">Tabla </w:t>
-      </w:r>
-      <w:proofErr w:type="spellStart"/>
+        <w:t>Tabla admin_users</w:t>
+      </w:r>
+    </w:p>
+    <w:p>
+      <w:r>
+        <w:t>Se implementó la tabla:</w:t>
+      </w:r>
+    </w:p>
+    <w:p>
       <w:r>
         <w:rPr>
           <w:b/>
@@ -3527,23 +2961,6 @@
         </w:rPr>
         <w:t>admin_users</w:t>
       </w:r>
-      <w:proofErr w:type="spellEnd"/>
-    </w:p>
-    <w:p>
-      <w:r>
-        <w:t>Se implementó la tabla:</w:t>
-      </w:r>
-    </w:p>
-    <w:p>
-      <w:proofErr w:type="spellStart"/>
-      <w:r>
-        <w:rPr>
-          <w:b/>
-          <w:bCs/>
-        </w:rPr>
-        <w:t>admin_users</w:t>
-      </w:r>
-      <w:proofErr w:type="spellEnd"/>
     </w:p>
     <w:p>
       <w:r>
@@ -3590,11 +3007,9 @@
           <w:numId w:val="9"/>
         </w:numPr>
       </w:pPr>
-      <w:proofErr w:type="spellStart"/>
       <w:r>
         <w:t>created_at</w:t>
       </w:r>
-      <w:proofErr w:type="spellEnd"/>
     </w:p>
     <w:p>
       <w:r>
@@ -3699,15 +3114,7 @@
         <w:t>✅</w:t>
       </w:r>
       <w:r>
-        <w:t xml:space="preserve"> Persistencia directa en </w:t>
-      </w:r>
-      <w:proofErr w:type="spellStart"/>
-      <w:r>
-        <w:t>Supabase</w:t>
-      </w:r>
-      <w:proofErr w:type="spellEnd"/>
-      <w:r>
-        <w:t>.</w:t>
+        <w:t xml:space="preserve"> Persistencia directa en Supabase.</w:t>
       </w:r>
     </w:p>
     <w:p>
@@ -3884,13 +3291,8 @@
       </w:r>
     </w:p>
     <w:p>
-      <w:proofErr w:type="gramStart"/>
-      <w:r>
-        <w:t>Además</w:t>
-      </w:r>
-      <w:proofErr w:type="gramEnd"/>
-      <w:r>
-        <w:t xml:space="preserve"> se mejoró la estrategia de nombres de archivos:</w:t>
+      <w:r>
+        <w:t>Además se mejoró la estrategia de nombres de archivos:</w:t>
       </w:r>
     </w:p>
     <w:p>
@@ -3996,34 +3398,18 @@
         <w:t>✅</w:t>
       </w:r>
       <w:r>
-        <w:t xml:space="preserve"> Integración completa de </w:t>
-      </w:r>
-      <w:proofErr w:type="spellStart"/>
-      <w:r>
-        <w:t>Supabase</w:t>
-      </w:r>
-      <w:proofErr w:type="spellEnd"/>
-      <w:r>
-        <w:t>.</w:t>
-      </w:r>
-    </w:p>
-    <w:p>
-      <w:r>
-        <w:rPr>
-          <w:rFonts w:ascii="Segoe UI Emoji" w:hAnsi="Segoe UI Emoji" w:cs="Segoe UI Emoji"/>
-        </w:rPr>
-        <w:t>✅</w:t>
-      </w:r>
-      <w:r>
-        <w:t xml:space="preserve"> Tabla </w:t>
-      </w:r>
-      <w:proofErr w:type="spellStart"/>
-      <w:r>
-        <w:t>projects</w:t>
-      </w:r>
-      <w:proofErr w:type="spellEnd"/>
-      <w:r>
-        <w:t xml:space="preserve"> operativa.</w:t>
+        <w:t xml:space="preserve"> Integración completa de Supabase.</w:t>
+      </w:r>
+    </w:p>
+    <w:p>
+      <w:r>
+        <w:rPr>
+          <w:rFonts w:ascii="Segoe UI Emoji" w:hAnsi="Segoe UI Emoji" w:cs="Segoe UI Emoji"/>
+        </w:rPr>
+        <w:t>✅</w:t>
+      </w:r>
+      <w:r>
+        <w:t xml:space="preserve"> Tabla projects operativa.</w:t>
       </w:r>
     </w:p>
     <w:p>
@@ -4067,34 +3453,18 @@
         <w:t>✅</w:t>
       </w:r>
       <w:r>
-        <w:t xml:space="preserve"> </w:t>
-      </w:r>
-      <w:proofErr w:type="spellStart"/>
-      <w:r>
-        <w:t>Supabase</w:t>
-      </w:r>
-      <w:proofErr w:type="spellEnd"/>
-      <w:r>
-        <w:t xml:space="preserve"> Auth operativo.</w:t>
-      </w:r>
-    </w:p>
-    <w:p>
-      <w:r>
-        <w:rPr>
-          <w:rFonts w:ascii="Segoe UI Emoji" w:hAnsi="Segoe UI Emoji" w:cs="Segoe UI Emoji"/>
-        </w:rPr>
-        <w:t>✅</w:t>
-      </w:r>
-      <w:r>
-        <w:t xml:space="preserve"> Tabla </w:t>
-      </w:r>
-      <w:proofErr w:type="spellStart"/>
-      <w:r>
-        <w:t>admin_users</w:t>
-      </w:r>
-      <w:proofErr w:type="spellEnd"/>
-      <w:r>
-        <w:t xml:space="preserve"> implementada.</w:t>
+        <w:t xml:space="preserve"> Supabase Auth operativo.</w:t>
+      </w:r>
+    </w:p>
+    <w:p>
+      <w:r>
+        <w:rPr>
+          <w:rFonts w:ascii="Segoe UI Emoji" w:hAnsi="Segoe UI Emoji" w:cs="Segoe UI Emoji"/>
+        </w:rPr>
+        <w:t>✅</w:t>
+      </w:r>
+      <w:r>
+        <w:t xml:space="preserve"> Tabla admin_users implementada.</w:t>
       </w:r>
     </w:p>
     <w:p>
@@ -4116,42 +3486,18 @@
         <w:t>✅</w:t>
       </w:r>
       <w:r>
-        <w:t xml:space="preserve"> </w:t>
-      </w:r>
-      <w:proofErr w:type="spellStart"/>
-      <w:r>
-        <w:t>Supabase</w:t>
-      </w:r>
-      <w:proofErr w:type="spellEnd"/>
-      <w:r>
-        <w:t xml:space="preserve"> Storage operativo.</w:t>
-      </w:r>
-    </w:p>
-    <w:p>
-      <w:r>
-        <w:rPr>
-          <w:rFonts w:ascii="Segoe UI Emoji" w:hAnsi="Segoe UI Emoji" w:cs="Segoe UI Emoji"/>
-        </w:rPr>
-        <w:t>✅</w:t>
-      </w:r>
-      <w:r>
-        <w:t xml:space="preserve"> </w:t>
-      </w:r>
-      <w:proofErr w:type="spellStart"/>
-      <w:r>
-        <w:t>Bucket</w:t>
-      </w:r>
-      <w:proofErr w:type="spellEnd"/>
-      <w:r>
-        <w:t xml:space="preserve"> </w:t>
-      </w:r>
-      <w:proofErr w:type="spellStart"/>
-      <w:r>
-        <w:t>projects</w:t>
-      </w:r>
-      <w:proofErr w:type="spellEnd"/>
-      <w:r>
-        <w:t xml:space="preserve"> implementado.</w:t>
+        <w:t xml:space="preserve"> Supabase Storage operativo.</w:t>
+      </w:r>
+    </w:p>
+    <w:p>
+      <w:r>
+        <w:rPr>
+          <w:rFonts w:ascii="Segoe UI Emoji" w:hAnsi="Segoe UI Emoji" w:cs="Segoe UI Emoji"/>
+        </w:rPr>
+        <w:t>✅</w:t>
+      </w:r>
+      <w:r>
+        <w:t xml:space="preserve"> Bucket projects implementado.</w:t>
       </w:r>
     </w:p>
     <w:p>
@@ -4199,15 +3545,7 @@
         <w:t>🔲</w:t>
       </w:r>
       <w:r>
-        <w:t xml:space="preserve"> Refinar validación automática de </w:t>
-      </w:r>
-      <w:proofErr w:type="spellStart"/>
-      <w:r>
-        <w:t>image_url</w:t>
-      </w:r>
-      <w:proofErr w:type="spellEnd"/>
-      <w:r>
-        <w:t xml:space="preserve"> tras carga de imágenes.</w:t>
+        <w:t xml:space="preserve"> Refinar validación automática de image_url tras carga de imágenes.</w:t>
       </w:r>
     </w:p>
     <w:p>
@@ -4241,15 +3579,7 @@
         <w:t>🔲</w:t>
       </w:r>
       <w:r>
-        <w:t xml:space="preserve"> Publicación en </w:t>
-      </w:r>
-      <w:proofErr w:type="spellStart"/>
-      <w:r>
-        <w:t>Vercel</w:t>
-      </w:r>
-      <w:proofErr w:type="spellEnd"/>
-      <w:r>
-        <w:t>.</w:t>
+        <w:t xml:space="preserve"> Publicación en Vercel.</w:t>
       </w:r>
     </w:p>
     <w:p>
@@ -4276,58 +3606,14 @@
     </w:p>
     <w:p>
       <w:r>
-        <w:t xml:space="preserve">La sesión permitió completar la transición desde un prototipo basado en datos simulados a una plataforma funcional soportada por </w:t>
-      </w:r>
-      <w:proofErr w:type="spellStart"/>
-      <w:r>
-        <w:t>Supabase</w:t>
-      </w:r>
-      <w:proofErr w:type="spellEnd"/>
-      <w:r>
-        <w:t xml:space="preserve">. El portal cuenta actualmente con catálogo dinámico de proyectos, almacenamiento multimedia, autenticación administrativa y operaciones CRUD completas. La arquitectura definida durante la fase inicial quedó validada en condiciones reales de operación, permitiendo avanzar hacia módulos de contenido institucional y publicación productiva del portal. </w:t>
+        <w:t xml:space="preserve">La sesión permitió completar la transición desde un prototipo basado en datos simulados a una plataforma funcional soportada por Supabase. El portal cuenta actualmente con catálogo dinámico de proyectos, almacenamiento multimedia, autenticación administrativa y operaciones CRUD completas. La arquitectura definida durante la fase inicial quedó validada en condiciones reales de operación, permitiendo avanzar hacia módulos de contenido institucional y publicación productiva del portal. </w:t>
       </w:r>
       <w:hyperlink r:id="rId11" w:history="1">
         <w:r>
           <w:rPr>
             <w:rStyle w:val="Hipervnculo"/>
           </w:rPr>
-          <w:t>[</w:t>
-        </w:r>
-        <w:proofErr w:type="spellStart"/>
-        <w:r>
-          <w:rPr>
-            <w:rStyle w:val="Hipervnculo"/>
-          </w:rPr>
-          <w:t>Bitácora_</w:t>
-        </w:r>
-        <w:proofErr w:type="gramStart"/>
-        <w:r>
-          <w:rPr>
-            <w:rStyle w:val="Hipervnculo"/>
-          </w:rPr>
-          <w:t>C</w:t>
-        </w:r>
-        <w:proofErr w:type="spellEnd"/>
-        <w:r>
-          <w:rPr>
-            <w:rStyle w:val="Hipervnculo"/>
-          </w:rPr>
-          <w:t>...</w:t>
-        </w:r>
-        <w:proofErr w:type="spellStart"/>
-        <w:proofErr w:type="gramEnd"/>
-        <w:r>
-          <w:rPr>
-            <w:rStyle w:val="Hipervnculo"/>
-          </w:rPr>
-          <w:t>zonamiento</w:t>
-        </w:r>
-        <w:proofErr w:type="spellEnd"/>
-        <w:r>
-          <w:rPr>
-            <w:rStyle w:val="Hipervnculo"/>
-          </w:rPr>
-          <w:t xml:space="preserve"> | Word]</w:t>
+          <w:t>[Bitácora_C...zonamiento | Word]</w:t>
         </w:r>
       </w:hyperlink>
       <w:r>
@@ -4338,43 +3624,7 @@
           <w:rPr>
             <w:rStyle w:val="Hipervnculo"/>
           </w:rPr>
-          <w:t>[</w:t>
-        </w:r>
-        <w:proofErr w:type="spellStart"/>
-        <w:r>
-          <w:rPr>
-            <w:rStyle w:val="Hipervnculo"/>
-          </w:rPr>
-          <w:t>Bitácora_</w:t>
-        </w:r>
-        <w:proofErr w:type="gramStart"/>
-        <w:r>
-          <w:rPr>
-            <w:rStyle w:val="Hipervnculo"/>
-          </w:rPr>
-          <w:t>C</w:t>
-        </w:r>
-        <w:proofErr w:type="spellEnd"/>
-        <w:r>
-          <w:rPr>
-            <w:rStyle w:val="Hipervnculo"/>
-          </w:rPr>
-          <w:t>...</w:t>
-        </w:r>
-        <w:proofErr w:type="spellStart"/>
-        <w:proofErr w:type="gramEnd"/>
-        <w:r>
-          <w:rPr>
-            <w:rStyle w:val="Hipervnculo"/>
-          </w:rPr>
-          <w:t>zonamiento</w:t>
-        </w:r>
-        <w:proofErr w:type="spellEnd"/>
-        <w:r>
-          <w:rPr>
-            <w:rStyle w:val="Hipervnculo"/>
-          </w:rPr>
-          <w:t xml:space="preserve"> | Word]</w:t>
+          <w:t>[Bitácora_C...zonamiento | Word]</w:t>
         </w:r>
       </w:hyperlink>
     </w:p>
@@ -4416,58 +3666,14 @@
         <w:t>FABLAB INACAP RENCA</w:t>
       </w:r>
       <w:r>
-        <w:t xml:space="preserve">, priorizando la consolidación de la experiencia pública orientada a la difusión de proyectos y la validación de los mecanismos de administración privada. Durante la sesión se completó la separación entre contenido destacado y catálogo completo de proyectos, se incorporó el primer módulo público de noticias y se fortaleció el control de acceso administrativo mediante validación integrada con </w:t>
-      </w:r>
-      <w:proofErr w:type="spellStart"/>
-      <w:r>
-        <w:t>Supabase</w:t>
-      </w:r>
-      <w:proofErr w:type="spellEnd"/>
-      <w:r>
-        <w:t xml:space="preserve"> Auth. La arquitectura base del portal, definida previamente como independiente y orientada a difusión institucional, se mantuvo sin modificaciones estructurales. </w:t>
+        <w:t xml:space="preserve">, priorizando la consolidación de la experiencia pública orientada a la difusión de proyectos y la validación de los mecanismos de administración privada. Durante la sesión se completó la separación entre contenido destacado y catálogo completo de proyectos, se incorporó el primer módulo público de noticias y se fortaleció el control de acceso administrativo mediante validación integrada con Supabase Auth. La arquitectura base del portal, definida previamente como independiente y orientada a difusión institucional, se mantuvo sin modificaciones estructurales. </w:t>
       </w:r>
       <w:hyperlink r:id="rId13" w:history="1">
         <w:r>
           <w:rPr>
             <w:rStyle w:val="Hipervnculo"/>
           </w:rPr>
-          <w:t>[</w:t>
-        </w:r>
-        <w:proofErr w:type="spellStart"/>
-        <w:r>
-          <w:rPr>
-            <w:rStyle w:val="Hipervnculo"/>
-          </w:rPr>
-          <w:t>Bitácora_</w:t>
-        </w:r>
-        <w:proofErr w:type="gramStart"/>
-        <w:r>
-          <w:rPr>
-            <w:rStyle w:val="Hipervnculo"/>
-          </w:rPr>
-          <w:t>C</w:t>
-        </w:r>
-        <w:proofErr w:type="spellEnd"/>
-        <w:r>
-          <w:rPr>
-            <w:rStyle w:val="Hipervnculo"/>
-          </w:rPr>
-          <w:t>...</w:t>
-        </w:r>
-        <w:proofErr w:type="spellStart"/>
-        <w:proofErr w:type="gramEnd"/>
-        <w:r>
-          <w:rPr>
-            <w:rStyle w:val="Hipervnculo"/>
-          </w:rPr>
-          <w:t>zonamiento</w:t>
-        </w:r>
-        <w:proofErr w:type="spellEnd"/>
-        <w:r>
-          <w:rPr>
-            <w:rStyle w:val="Hipervnculo"/>
-          </w:rPr>
-          <w:t xml:space="preserve"> | Word]</w:t>
+          <w:t>[Bitácora_C...zonamiento | Word]</w:t>
         </w:r>
       </w:hyperlink>
       <w:r>
@@ -4478,43 +3684,7 @@
           <w:rPr>
             <w:rStyle w:val="Hipervnculo"/>
           </w:rPr>
-          <w:t>[</w:t>
-        </w:r>
-        <w:proofErr w:type="spellStart"/>
-        <w:r>
-          <w:rPr>
-            <w:rStyle w:val="Hipervnculo"/>
-          </w:rPr>
-          <w:t>Bitácora_</w:t>
-        </w:r>
-        <w:proofErr w:type="gramStart"/>
-        <w:r>
-          <w:rPr>
-            <w:rStyle w:val="Hipervnculo"/>
-          </w:rPr>
-          <w:t>C</w:t>
-        </w:r>
-        <w:proofErr w:type="spellEnd"/>
-        <w:r>
-          <w:rPr>
-            <w:rStyle w:val="Hipervnculo"/>
-          </w:rPr>
-          <w:t>...</w:t>
-        </w:r>
-        <w:proofErr w:type="spellStart"/>
-        <w:proofErr w:type="gramEnd"/>
-        <w:r>
-          <w:rPr>
-            <w:rStyle w:val="Hipervnculo"/>
-          </w:rPr>
-          <w:t>zonamiento</w:t>
-        </w:r>
-        <w:proofErr w:type="spellEnd"/>
-        <w:r>
-          <w:rPr>
-            <w:rStyle w:val="Hipervnculo"/>
-          </w:rPr>
-          <w:t xml:space="preserve"> | Word]</w:t>
+          <w:t>[Bitácora_C...zonamiento | Word]</w:t>
         </w:r>
       </w:hyperlink>
     </w:p>
@@ -4731,15 +3901,7 @@
         <w:t>✅</w:t>
       </w:r>
       <w:r>
-        <w:t xml:space="preserve"> Carga individual desde </w:t>
-      </w:r>
-      <w:proofErr w:type="spellStart"/>
-      <w:r>
-        <w:t>Supabase</w:t>
-      </w:r>
-      <w:proofErr w:type="spellEnd"/>
-      <w:r>
-        <w:t>.</w:t>
+        <w:t xml:space="preserve"> Carga individual desde Supabase.</w:t>
       </w:r>
     </w:p>
     <w:p>
@@ -4838,13 +4000,8 @@
           <w:numId w:val="12"/>
         </w:numPr>
       </w:pPr>
-      <w:proofErr w:type="spellStart"/>
-      <w:r>
-        <w:t>video_url</w:t>
-      </w:r>
-      <w:proofErr w:type="spellEnd"/>
-      <w:r>
-        <w:t>;</w:t>
+      <w:r>
+        <w:t>video_url;</w:t>
       </w:r>
     </w:p>
     <w:p>
@@ -4854,13 +4011,8 @@
           <w:numId w:val="12"/>
         </w:numPr>
       </w:pPr>
-      <w:proofErr w:type="spellStart"/>
-      <w:r>
-        <w:t>open_sam_url</w:t>
-      </w:r>
-      <w:proofErr w:type="spellEnd"/>
-      <w:r>
-        <w:t>.</w:t>
+      <w:r>
+        <w:t>open_sam_url.</w:t>
       </w:r>
     </w:p>
     <w:p>
@@ -4916,116 +4068,51 @@
         <w:t>✅</w:t>
       </w:r>
       <w:r>
-        <w:t xml:space="preserve"> </w:t>
-      </w:r>
-      <w:proofErr w:type="spellStart"/>
-      <w:proofErr w:type="gramStart"/>
-      <w:r>
-        <w:t>getPublishedNews</w:t>
-      </w:r>
-      <w:proofErr w:type="spellEnd"/>
-      <w:r>
-        <w:t>(</w:t>
-      </w:r>
-      <w:proofErr w:type="gramEnd"/>
-      <w:r>
-        <w:t>)</w:t>
-      </w:r>
-    </w:p>
-    <w:p>
-      <w:r>
-        <w:rPr>
-          <w:rFonts w:ascii="Segoe UI Emoji" w:hAnsi="Segoe UI Emoji" w:cs="Segoe UI Emoji"/>
-        </w:rPr>
-        <w:t>✅</w:t>
-      </w:r>
-      <w:r>
-        <w:t xml:space="preserve"> </w:t>
-      </w:r>
-      <w:proofErr w:type="spellStart"/>
-      <w:proofErr w:type="gramStart"/>
-      <w:r>
-        <w:t>getNewsById</w:t>
-      </w:r>
-      <w:proofErr w:type="spellEnd"/>
-      <w:r>
-        <w:t>(</w:t>
-      </w:r>
-      <w:proofErr w:type="gramEnd"/>
-      <w:r>
-        <w:t>)</w:t>
-      </w:r>
-    </w:p>
-    <w:p>
-      <w:r>
-        <w:rPr>
-          <w:rFonts w:ascii="Segoe UI Emoji" w:hAnsi="Segoe UI Emoji" w:cs="Segoe UI Emoji"/>
-        </w:rPr>
-        <w:t>✅</w:t>
-      </w:r>
-      <w:r>
-        <w:t xml:space="preserve"> </w:t>
-      </w:r>
-      <w:proofErr w:type="spellStart"/>
-      <w:proofErr w:type="gramStart"/>
-      <w:r>
-        <w:t>createNews</w:t>
-      </w:r>
-      <w:proofErr w:type="spellEnd"/>
-      <w:r>
-        <w:t>(</w:t>
-      </w:r>
-      <w:proofErr w:type="gramEnd"/>
-      <w:r>
-        <w:t>)</w:t>
-      </w:r>
-    </w:p>
-    <w:p>
-      <w:r>
-        <w:rPr>
-          <w:rFonts w:ascii="Segoe UI Emoji" w:hAnsi="Segoe UI Emoji" w:cs="Segoe UI Emoji"/>
-        </w:rPr>
-        <w:t>✅</w:t>
-      </w:r>
-      <w:r>
-        <w:t xml:space="preserve"> </w:t>
-      </w:r>
-      <w:proofErr w:type="spellStart"/>
-      <w:proofErr w:type="gramStart"/>
-      <w:r>
-        <w:t>updateNews</w:t>
-      </w:r>
-      <w:proofErr w:type="spellEnd"/>
-      <w:r>
-        <w:t>(</w:t>
-      </w:r>
-      <w:proofErr w:type="gramEnd"/>
-      <w:r>
-        <w:t>)</w:t>
-      </w:r>
-    </w:p>
-    <w:p>
-      <w:r>
-        <w:rPr>
-          <w:rFonts w:ascii="Segoe UI Emoji" w:hAnsi="Segoe UI Emoji" w:cs="Segoe UI Emoji"/>
-        </w:rPr>
-        <w:t>✅</w:t>
-      </w:r>
-      <w:r>
-        <w:t xml:space="preserve"> </w:t>
-      </w:r>
-      <w:proofErr w:type="spellStart"/>
-      <w:proofErr w:type="gramStart"/>
-      <w:r>
-        <w:t>deleteNews</w:t>
-      </w:r>
-      <w:proofErr w:type="spellEnd"/>
-      <w:r>
-        <w:t>(</w:t>
-      </w:r>
-      <w:proofErr w:type="gramEnd"/>
-      <w:r>
-        <w:t>)</w:t>
+        <w:t xml:space="preserve"> getPublishedNews()</w:t>
+      </w:r>
+    </w:p>
+    <w:p>
+      <w:r>
+        <w:rPr>
+          <w:rFonts w:ascii="Segoe UI Emoji" w:hAnsi="Segoe UI Emoji" w:cs="Segoe UI Emoji"/>
+        </w:rPr>
+        <w:t>✅</w:t>
+      </w:r>
+      <w:r>
+        <w:t xml:space="preserve"> getNewsById()</w:t>
+      </w:r>
+    </w:p>
+    <w:p>
+      <w:r>
+        <w:rPr>
+          <w:rFonts w:ascii="Segoe UI Emoji" w:hAnsi="Segoe UI Emoji" w:cs="Segoe UI Emoji"/>
+        </w:rPr>
+        <w:t>✅</w:t>
+      </w:r>
+      <w:r>
+        <w:t xml:space="preserve"> createNews()</w:t>
+      </w:r>
+    </w:p>
+    <w:p>
+      <w:r>
+        <w:rPr>
+          <w:rFonts w:ascii="Segoe UI Emoji" w:hAnsi="Segoe UI Emoji" w:cs="Segoe UI Emoji"/>
+        </w:rPr>
+        <w:t>✅</w:t>
+      </w:r>
+      <w:r>
+        <w:t xml:space="preserve"> updateNews()</w:t>
+      </w:r>
+    </w:p>
+    <w:p>
+      <w:r>
+        <w:rPr>
+          <w:rFonts w:ascii="Segoe UI Emoji" w:hAnsi="Segoe UI Emoji" w:cs="Segoe UI Emoji"/>
+        </w:rPr>
+        <w:t>✅</w:t>
+      </w:r>
+      <w:r>
+        <w:t xml:space="preserve"> deleteNews()</w:t>
       </w:r>
     </w:p>
     <w:p>
@@ -5056,15 +4143,7 @@
         <w:t>✅</w:t>
       </w:r>
       <w:r>
-        <w:t xml:space="preserve"> Lectura pública desde </w:t>
-      </w:r>
-      <w:proofErr w:type="spellStart"/>
-      <w:r>
-        <w:t>Supabase</w:t>
-      </w:r>
-      <w:proofErr w:type="spellEnd"/>
-      <w:r>
-        <w:t>.</w:t>
+        <w:t xml:space="preserve"> Lectura pública desde Supabase.</w:t>
       </w:r>
     </w:p>
     <w:p>
@@ -5137,11 +4216,9 @@
       </w:r>
     </w:p>
     <w:p>
-      <w:proofErr w:type="spellStart"/>
       <w:r>
         <w:t>Vercel</w:t>
       </w:r>
-      <w:proofErr w:type="spellEnd"/>
     </w:p>
     <w:p>
       <w:r>
@@ -5188,15 +4265,7 @@
         <w:t>✅</w:t>
       </w:r>
       <w:r>
-        <w:t xml:space="preserve"> Integración operativa con </w:t>
-      </w:r>
-      <w:proofErr w:type="spellStart"/>
-      <w:r>
-        <w:t>Supabase</w:t>
-      </w:r>
-      <w:proofErr w:type="spellEnd"/>
-      <w:r>
-        <w:t>.</w:t>
+        <w:t xml:space="preserve"> Integración operativa con Supabase.</w:t>
       </w:r>
     </w:p>
     <w:p>
@@ -5241,13 +4310,8 @@
       </w:r>
     </w:p>
     <w:p>
-      <w:proofErr w:type="spellStart"/>
-      <w:r>
-        <w:t>Supabase</w:t>
-      </w:r>
-      <w:proofErr w:type="spellEnd"/>
-      <w:r>
-        <w:t xml:space="preserve"> Auth</w:t>
+      <w:r>
+        <w:t>Supabase Auth</w:t>
       </w:r>
     </w:p>
     <w:p>
@@ -5267,13 +4331,8 @@
     </w:p>
     <w:p>
       <w:r>
-        <w:t xml:space="preserve">Tabla </w:t>
-      </w:r>
-      <w:proofErr w:type="spellStart"/>
-      <w:r>
-        <w:t>admin_users</w:t>
-      </w:r>
-      <w:proofErr w:type="spellEnd"/>
+        <w:t>Tabla admin_users</w:t>
+      </w:r>
     </w:p>
     <w:p>
       <w:r>
@@ -5329,23 +4388,7 @@
         <w:t>✅</w:t>
       </w:r>
       <w:r>
-        <w:t xml:space="preserve"> Redirección directa del botón "Panel </w:t>
-      </w:r>
-      <w:proofErr w:type="spellStart"/>
-      <w:r>
-        <w:t>admin</w:t>
-      </w:r>
-      <w:proofErr w:type="spellEnd"/>
-      <w:r>
-        <w:t>" hacia /</w:t>
-      </w:r>
-      <w:proofErr w:type="spellStart"/>
-      <w:r>
-        <w:t>admin</w:t>
-      </w:r>
-      <w:proofErr w:type="spellEnd"/>
-      <w:r>
-        <w:t>.</w:t>
+        <w:t xml:space="preserve"> Redirección directa del botón "Panel admin" hacia /admin.</w:t>
       </w:r>
     </w:p>
     <w:p>
@@ -5415,36 +4458,18 @@
         <w:t>✅</w:t>
       </w:r>
       <w:r>
-        <w:t xml:space="preserve"> Existencia de usuario administrador en tabla </w:t>
-      </w:r>
-      <w:proofErr w:type="spellStart"/>
-      <w:r>
-        <w:t>admin_users</w:t>
-      </w:r>
-      <w:proofErr w:type="spellEnd"/>
-      <w:r>
-        <w:t>.</w:t>
-      </w:r>
-    </w:p>
-    <w:p>
-      <w:r>
-        <w:rPr>
-          <w:rFonts w:ascii="Segoe UI Emoji" w:hAnsi="Segoe UI Emoji" w:cs="Segoe UI Emoji"/>
-        </w:rPr>
-        <w:t>✅</w:t>
-      </w:r>
-      <w:r>
-        <w:t xml:space="preserve"> Existencia del mismo usuario en </w:t>
-      </w:r>
-      <w:proofErr w:type="spellStart"/>
-      <w:proofErr w:type="gramStart"/>
-      <w:r>
-        <w:t>auth.users</w:t>
-      </w:r>
-      <w:proofErr w:type="spellEnd"/>
-      <w:proofErr w:type="gramEnd"/>
-      <w:r>
-        <w:t>.</w:t>
+        <w:t xml:space="preserve"> Existencia de usuario administrador en tabla admin_users.</w:t>
+      </w:r>
+    </w:p>
+    <w:p>
+      <w:r>
+        <w:rPr>
+          <w:rFonts w:ascii="Segoe UI Emoji" w:hAnsi="Segoe UI Emoji" w:cs="Segoe UI Emoji"/>
+        </w:rPr>
+        <w:t>✅</w:t>
+      </w:r>
+      <w:r>
+        <w:t xml:space="preserve"> Existencia del mismo usuario en auth.users.</w:t>
       </w:r>
     </w:p>
     <w:p>
@@ -5466,15 +4491,7 @@
         <w:t>✅</w:t>
       </w:r>
       <w:r>
-        <w:t xml:space="preserve"> Integración con la misma instancia </w:t>
-      </w:r>
-      <w:proofErr w:type="spellStart"/>
-      <w:r>
-        <w:t>Supabase</w:t>
-      </w:r>
-      <w:proofErr w:type="spellEnd"/>
-      <w:r>
-        <w:t xml:space="preserve"> utilizada por FABLAB Access.</w:t>
+        <w:t xml:space="preserve"> Integración con la misma instancia Supabase utilizada por FABLAB Access.</w:t>
       </w:r>
     </w:p>
     <w:p>
@@ -5513,16 +4530,9 @@
       </w:r>
     </w:p>
     <w:p>
-      <w:proofErr w:type="spellStart"/>
-      <w:proofErr w:type="gramStart"/>
-      <w:r>
-        <w:t>projects.image</w:t>
-      </w:r>
-      <w:proofErr w:type="gramEnd"/>
-      <w:r>
-        <w:t>_url</w:t>
-      </w:r>
-      <w:proofErr w:type="spellEnd"/>
+      <w:r>
+        <w:t>projects.image_url</w:t>
+      </w:r>
     </w:p>
     <w:p>
       <w:r>
@@ -5554,15 +4564,7 @@
         </w:numPr>
       </w:pPr>
       <w:r>
-        <w:t xml:space="preserve">1600 x 900 </w:t>
-      </w:r>
-      <w:proofErr w:type="spellStart"/>
-      <w:r>
-        <w:t>px</w:t>
-      </w:r>
-      <w:proofErr w:type="spellEnd"/>
-      <w:r>
-        <w:t>;</w:t>
+        <w:t>1600 x 900 px;</w:t>
       </w:r>
     </w:p>
     <w:p>
@@ -5629,15 +4631,7 @@
         <w:t>✅</w:t>
       </w:r>
       <w:r>
-        <w:t xml:space="preserve"> Portal desplegado en </w:t>
-      </w:r>
-      <w:proofErr w:type="spellStart"/>
-      <w:r>
-        <w:t>Vercel</w:t>
-      </w:r>
-      <w:proofErr w:type="spellEnd"/>
-      <w:r>
-        <w:t>.</w:t>
+        <w:t xml:space="preserve"> Portal desplegado en Vercel.</w:t>
       </w:r>
     </w:p>
     <w:p>
@@ -5759,34 +4753,18 @@
         <w:t>✅</w:t>
       </w:r>
       <w:r>
-        <w:t xml:space="preserve"> Integración con </w:t>
-      </w:r>
-      <w:proofErr w:type="spellStart"/>
-      <w:r>
-        <w:t>Supabase</w:t>
-      </w:r>
-      <w:proofErr w:type="spellEnd"/>
-      <w:r>
-        <w:t xml:space="preserve"> Auth validada.</w:t>
-      </w:r>
-    </w:p>
-    <w:p>
-      <w:r>
-        <w:rPr>
-          <w:rFonts w:ascii="Segoe UI Emoji" w:hAnsi="Segoe UI Emoji" w:cs="Segoe UI Emoji"/>
-        </w:rPr>
-        <w:t>✅</w:t>
-      </w:r>
-      <w:r>
-        <w:t xml:space="preserve"> Validación mediante </w:t>
-      </w:r>
-      <w:proofErr w:type="spellStart"/>
-      <w:r>
-        <w:t>admin_users</w:t>
-      </w:r>
-      <w:proofErr w:type="spellEnd"/>
-      <w:r>
-        <w:t xml:space="preserve"> activa.</w:t>
+        <w:t xml:space="preserve"> Integración con Supabase Auth validada.</w:t>
+      </w:r>
+    </w:p>
+    <w:p>
+      <w:r>
+        <w:rPr>
+          <w:rFonts w:ascii="Segoe UI Emoji" w:hAnsi="Segoe UI Emoji" w:cs="Segoe UI Emoji"/>
+        </w:rPr>
+        <w:t>✅</w:t>
+      </w:r>
+      <w:r>
+        <w:t xml:space="preserve"> Validación mediante admin_users activa.</w:t>
       </w:r>
     </w:p>
     <w:p>
@@ -5839,15 +4817,7 @@
         <w:t>🔲</w:t>
       </w:r>
       <w:r>
-        <w:t xml:space="preserve"> Corregir definitivamente referencias multimedia contaminadas por </w:t>
-      </w:r>
-      <w:proofErr w:type="spellStart"/>
-      <w:r>
-        <w:t>URLs</w:t>
-      </w:r>
-      <w:proofErr w:type="spellEnd"/>
-      <w:r>
-        <w:t xml:space="preserve"> generadas automáticamente durante el desarrollo.</w:t>
+        <w:t xml:space="preserve"> Corregir definitivamente referencias multimedia contaminadas por URLs generadas automáticamente durante el desarrollo.</w:t>
       </w:r>
     </w:p>
     <w:p>
@@ -5902,15 +4872,7 @@
         <w:t>🔲</w:t>
       </w:r>
       <w:r>
-        <w:t xml:space="preserve"> Implementar configuración institucional mediante tabla </w:t>
-      </w:r>
-      <w:proofErr w:type="spellStart"/>
-      <w:r>
-        <w:t>settings</w:t>
-      </w:r>
-      <w:proofErr w:type="spellEnd"/>
-      <w:r>
-        <w:t>.</w:t>
+        <w:t xml:space="preserve"> Implementar configuración institucional mediante tabla settings.</w:t>
       </w:r>
     </w:p>
     <w:p>
@@ -5935,23 +4897,7 @@
     </w:p>
     <w:p>
       <w:r>
-        <w:t xml:space="preserve">La sesión permitió consolidar la transición desde una plataforma centrada en listados hacia una experiencia pública estructurada en torno a contenidos dedicados. Se completó la separación entre Home, catálogo de proyectos y noticias, mejorando significativamente la navegación institucional del portal. Paralelamente, se validó la publicación en producción mediante </w:t>
-      </w:r>
-      <w:proofErr w:type="spellStart"/>
-      <w:r>
-        <w:t>Vercel</w:t>
-      </w:r>
-      <w:proofErr w:type="spellEnd"/>
-      <w:r>
-        <w:t xml:space="preserve"> y se reforzó la seguridad administrativa mediante </w:t>
-      </w:r>
-      <w:proofErr w:type="spellStart"/>
-      <w:r>
-        <w:t>Supabase</w:t>
-      </w:r>
-      <w:proofErr w:type="spellEnd"/>
-      <w:r>
-        <w:t xml:space="preserve"> Auth y </w:t>
+        <w:t xml:space="preserve">La sesión permitió consolidar la transición desde una plataforma centrada en listados hacia una experiencia pública estructurada en torno a contenidos dedicados. Se completó la separación entre Home, catálogo de proyectos y noticias, mejorando significativamente la navegación institucional del portal. Paralelamente, se validó la publicación en producción mediante Vercel y se reforzó la seguridad administrativa mediante Supabase Auth y </w:t>
       </w:r>
       <w:r>
         <w:lastRenderedPageBreak/>
@@ -5959,19 +4905,353 @@
       </w:r>
     </w:p>
     <w:p/>
+    <w:p>
+      <w:pPr>
+        <w:pStyle w:val="Ttulo1"/>
+        <w:rPr>
+          <w:b/>
+          <w:bCs/>
+        </w:rPr>
+      </w:pPr>
+      <w:r>
+        <w:rPr>
+          <w:b/>
+          <w:bCs/>
+        </w:rPr>
+        <w:t>SESIÓN 21/09/2026 – ACTUALIZACIÓN DE BACKLOG FUNCIONAL DEL PORTAL FABLAB</w:t>
+      </w:r>
+    </w:p>
+    <w:p>
+      <w:r>
+        <w:rPr>
+          <w:b/>
+          <w:bCs/>
+        </w:rPr>
+        <w:t>Contexto</w:t>
+      </w:r>
+    </w:p>
+    <w:p>
+      <w:r>
+        <w:t>Se revisaron y consolidaron nuevos requerimientos funcionales pendientes para una próxima iteración del portal de proyectos FABLAB.</w:t>
+      </w:r>
+    </w:p>
+    <w:p>
+      <w:r>
+        <w:rPr>
+          <w:b/>
+          <w:bCs/>
+        </w:rPr>
+        <w:t>Gestión de Categorías</w:t>
+      </w:r>
+    </w:p>
+    <w:p>
+      <w:r>
+        <w:t>Se definió la incorporación de una nueva categoría para el catálogo de proyectos:</w:t>
+      </w:r>
+    </w:p>
+    <w:p>
+      <w:pPr>
+        <w:numPr>
+          <w:ilvl w:val="0"/>
+          <w:numId w:val="14"/>
+        </w:numPr>
+      </w:pPr>
+      <w:r>
+        <w:t>Electricidad y Energías Renovables.</w:t>
+      </w:r>
+    </w:p>
+    <w:p>
+      <w:r>
+        <w:t>La categoría deberá estar disponible tanto en la administración de proyectos como en los filtros públicos del sitio, manteniendo compatibilidad con la estructura actual de proyectos.</w:t>
+      </w:r>
+    </w:p>
+    <w:p>
+      <w:r>
+        <w:rPr>
+          <w:b/>
+          <w:bCs/>
+        </w:rPr>
+        <w:t>Nuevos Módulos Institucionales</w:t>
+      </w:r>
+    </w:p>
+    <w:p>
+      <w:r>
+        <w:t>Se aprobó registrar como pendiente la creación de una nueva sección institucional:</w:t>
+      </w:r>
+    </w:p>
+    <w:p>
+      <w:pPr>
+        <w:numPr>
+          <w:ilvl w:val="0"/>
+          <w:numId w:val="15"/>
+        </w:numPr>
+      </w:pPr>
+      <w:r>
+        <w:t>Charlas y Talleres.</w:t>
+      </w:r>
+    </w:p>
+    <w:p>
+      <w:r>
+        <w:t>El objetivo es disponer de un espacio para publicar actividades, capacitaciones, talleres, charlas y evidencias o resultados asociados.</w:t>
+      </w:r>
+    </w:p>
+    <w:p>
+      <w:r>
+        <w:rPr>
+          <w:b/>
+          <w:bCs/>
+        </w:rPr>
+        <w:t>Mejoras de Búsqueda</w:t>
+      </w:r>
+    </w:p>
+    <w:p>
+      <w:r>
+        <w:t>Se definió una mejora para el buscador público "Buscar proyectos".</w:t>
+      </w:r>
+    </w:p>
+    <w:p>
+      <w:r>
+        <w:t>La búsqueda deberá evolucionar hacia una búsqueda integral de contenidos, considerando no solo el título del proyecto, sino también información interna relevante como:</w:t>
+      </w:r>
+    </w:p>
+    <w:p>
+      <w:pPr>
+        <w:numPr>
+          <w:ilvl w:val="0"/>
+          <w:numId w:val="16"/>
+        </w:numPr>
+      </w:pPr>
+      <w:r>
+        <w:t>Resumen.</w:t>
+      </w:r>
+    </w:p>
+    <w:p>
+      <w:pPr>
+        <w:numPr>
+          <w:ilvl w:val="0"/>
+          <w:numId w:val="16"/>
+        </w:numPr>
+      </w:pPr>
+      <w:r>
+        <w:t>Descripción.</w:t>
+      </w:r>
+    </w:p>
+    <w:p>
+      <w:pPr>
+        <w:numPr>
+          <w:ilvl w:val="0"/>
+          <w:numId w:val="16"/>
+        </w:numPr>
+      </w:pPr>
+      <w:r>
+        <w:t>Categoría.</w:t>
+      </w:r>
+    </w:p>
+    <w:p>
+      <w:pPr>
+        <w:numPr>
+          <w:ilvl w:val="0"/>
+          <w:numId w:val="16"/>
+        </w:numPr>
+      </w:pPr>
+      <w:r>
+        <w:t>Tecnologías utilizadas.</w:t>
+      </w:r>
+    </w:p>
+    <w:p>
+      <w:pPr>
+        <w:numPr>
+          <w:ilvl w:val="0"/>
+          <w:numId w:val="16"/>
+        </w:numPr>
+      </w:pPr>
+      <w:r>
+        <w:t>Integrantes o participantes.</w:t>
+      </w:r>
+    </w:p>
+    <w:p>
+      <w:pPr>
+        <w:numPr>
+          <w:ilvl w:val="0"/>
+          <w:numId w:val="16"/>
+        </w:numPr>
+      </w:pPr>
+      <w:r>
+        <w:t>Otros campos de contenido asociados al proyecto.</w:t>
+      </w:r>
+    </w:p>
+    <w:p>
+      <w:r>
+        <w:lastRenderedPageBreak/>
+        <w:t>El objetivo es que los proyectos puedan encontrarse aunque el término buscado no esté presente en el título visible.</w:t>
+      </w:r>
+    </w:p>
+    <w:p>
+      <w:r>
+        <w:rPr>
+          <w:b/>
+          <w:bCs/>
+        </w:rPr>
+        <w:t>Estado Actual</w:t>
+      </w:r>
+    </w:p>
+    <w:p>
+      <w:r>
+        <w:t>Portal operativo con nuevas definiciones funcionales registradas para próximas iteraciones.</w:t>
+      </w:r>
+    </w:p>
+    <w:p>
+      <w:r>
+        <w:rPr>
+          <w:b/>
+          <w:bCs/>
+        </w:rPr>
+        <w:t>Completado</w:t>
+      </w:r>
+    </w:p>
+    <w:p>
+      <w:r>
+        <w:rPr>
+          <w:rFonts w:ascii="Segoe UI Emoji" w:hAnsi="Segoe UI Emoji" w:cs="Segoe UI Emoji"/>
+        </w:rPr>
+        <w:t>✅</w:t>
+      </w:r>
+      <w:r>
+        <w:t xml:space="preserve"> Definida nueva categoría "Electricidad y Energías Renovables".</w:t>
+      </w:r>
+      <w:r>
+        <w:br/>
+      </w:r>
+      <w:r>
+        <w:rPr>
+          <w:rFonts w:ascii="Segoe UI Emoji" w:hAnsi="Segoe UI Emoji" w:cs="Segoe UI Emoji"/>
+        </w:rPr>
+        <w:t>✅</w:t>
+      </w:r>
+      <w:r>
+        <w:t xml:space="preserve"> Definida nueva secci</w:t>
+      </w:r>
+      <w:r>
+        <w:rPr>
+          <w:rFonts w:ascii="Aptos" w:hAnsi="Aptos" w:cs="Aptos"/>
+        </w:rPr>
+        <w:t>ó</w:t>
+      </w:r>
+      <w:r>
+        <w:t>n institucional "Charlas y Talleres".</w:t>
+      </w:r>
+      <w:r>
+        <w:br/>
+      </w:r>
+      <w:r>
+        <w:rPr>
+          <w:rFonts w:ascii="Segoe UI Emoji" w:hAnsi="Segoe UI Emoji" w:cs="Segoe UI Emoji"/>
+        </w:rPr>
+        <w:t>✅</w:t>
+      </w:r>
+      <w:r>
+        <w:t xml:space="preserve"> Definido requerimiento de b</w:t>
+      </w:r>
+      <w:r>
+        <w:rPr>
+          <w:rFonts w:ascii="Aptos" w:hAnsi="Aptos" w:cs="Aptos"/>
+        </w:rPr>
+        <w:t>ú</w:t>
+      </w:r>
+      <w:r>
+        <w:t>squeda integral para "Buscar proyectos".</w:t>
+      </w:r>
+      <w:r>
+        <w:br/>
+      </w:r>
+      <w:r>
+        <w:rPr>
+          <w:rFonts w:ascii="Segoe UI Emoji" w:hAnsi="Segoe UI Emoji" w:cs="Segoe UI Emoji"/>
+        </w:rPr>
+        <w:t>✅</w:t>
+      </w:r>
+      <w:r>
+        <w:t xml:space="preserve"> Requerimientos incorporados al backlog funcional pendiente.</w:t>
+      </w:r>
+    </w:p>
+    <w:p>
+      <w:r>
+        <w:rPr>
+          <w:b/>
+          <w:bCs/>
+        </w:rPr>
+        <w:t>Pendiente Prioritario</w:t>
+      </w:r>
+    </w:p>
+    <w:p>
+      <w:r>
+        <w:rPr>
+          <w:rFonts w:ascii="Segoe UI Emoji" w:hAnsi="Segoe UI Emoji" w:cs="Segoe UI Emoji"/>
+        </w:rPr>
+        <w:t>🔲</w:t>
+      </w:r>
+      <w:r>
+        <w:t xml:space="preserve"> Implementar categoría "Electricidad y Energías Renovables" en administración y filtros públicos.</w:t>
+      </w:r>
+      <w:r>
+        <w:br/>
+      </w:r>
+      <w:r>
+        <w:rPr>
+          <w:rFonts w:ascii="Segoe UI Emoji" w:hAnsi="Segoe UI Emoji" w:cs="Segoe UI Emoji"/>
+        </w:rPr>
+        <w:t>🔲</w:t>
+      </w:r>
+      <w:r>
+        <w:t xml:space="preserve"> Implementar módulo "Charlas y Talleres".</w:t>
+      </w:r>
+      <w:r>
+        <w:br/>
+      </w:r>
+      <w:r>
+        <w:rPr>
+          <w:rFonts w:ascii="Segoe UI Emoji" w:hAnsi="Segoe UI Emoji" w:cs="Segoe UI Emoji"/>
+        </w:rPr>
+        <w:t>🔲</w:t>
+      </w:r>
+      <w:r>
+        <w:t xml:space="preserve"> Implementar búsqueda integral dentro del contenido completo de cada proyecto (Full Search).</w:t>
+      </w:r>
+      <w:r>
+        <w:br/>
+      </w:r>
+      <w:r>
+        <w:rPr>
+          <w:rFonts w:ascii="Segoe UI Emoji" w:hAnsi="Segoe UI Emoji" w:cs="Segoe UI Emoji"/>
+        </w:rPr>
+        <w:t>🔲</w:t>
+      </w:r>
+      <w:r>
+        <w:t xml:space="preserve"> Validar rendimiento de la búsqueda cuando aumente la cantidad de proyectos publicados.</w:t>
+      </w:r>
+    </w:p>
+    <w:p>
+      <w:r>
+        <w:rPr>
+          <w:b/>
+          <w:bCs/>
+        </w:rPr>
+        <w:t>Conclusión Técnica</w:t>
+      </w:r>
+    </w:p>
+    <w:p>
+      <w:r>
+        <w:t>Se amplió el backlog funcional del portal con mejoras orientadas a ampliar la cobertura temática de los proyectos, visibilizar actividades institucionales del FABLAB y mejorar significativamente la experiencia de búsqueda mediante una indexación más completa de la información de cada proyecto.</w:t>
+      </w:r>
+    </w:p>
     <w:p/>
     <w:p/>
     <w:p>
       <w:pPr>
         <w:pStyle w:val="Ttulo1"/>
       </w:pPr>
-      <w:proofErr w:type="spellStart"/>
-      <w:r>
-        <w:t>Promt</w:t>
-      </w:r>
-      <w:proofErr w:type="spellEnd"/>
-      <w:r>
-        <w:t xml:space="preserve"> para imágenes</w:t>
+      <w:r>
+        <w:t>Promt para imágenes</w:t>
       </w:r>
     </w:p>
     <w:p>
@@ -6051,188 +5331,188 @@
     </w:p>
     <w:p>
       <w:r>
+        <w:t>- Apariencia realista.</w:t>
+      </w:r>
+    </w:p>
+    <w:p>
+      <w:r>
+        <w:t>- Alto nivel de detalle.</w:t>
+      </w:r>
+    </w:p>
+    <w:p>
+      <w:r>
+        <w:t>- Iluminación limpia y equilibrada.</w:t>
+      </w:r>
+    </w:p>
+    <w:p>
+      <w:r>
+        <w:t>- Diseño visual atractivo para sitio web.</w:t>
+      </w:r>
+    </w:p>
+    <w:p>
+      <w:r>
+        <w:t>- Aspecto tecnológico, educativo e innovador.</w:t>
+      </w:r>
+    </w:p>
+    <w:p>
+      <w:r>
+        <w:t>- Composición dinámica pero ordenada.</w:t>
+      </w:r>
+    </w:p>
+    <w:p/>
+    <w:p>
+      <w:r>
+        <w:t>TEXTO INTEGRADO:</w:t>
+      </w:r>
+    </w:p>
+    <w:p/>
+    <w:p>
+      <w:r>
+        <w:t>Agregar un único título breve relacionado con el proyecto.</w:t>
+      </w:r>
+    </w:p>
+    <w:p/>
+    <w:p>
+      <w:r>
+        <w:t>Título:</w:t>
+      </w:r>
+    </w:p>
+    <w:p>
+      <w:r>
+        <w:t>"[NOMBRE DEL PROYECTO]"</w:t>
+      </w:r>
+    </w:p>
+    <w:p/>
+    <w:p>
+      <w:r>
+        <w:t>Características del texto:</w:t>
+      </w:r>
+    </w:p>
+    <w:p>
+      <w:r>
         <w:lastRenderedPageBreak/>
-        <w:t>- Apariencia realista.</w:t>
-      </w:r>
-    </w:p>
-    <w:p>
-      <w:r>
-        <w:t>- Alto nivel de detalle.</w:t>
-      </w:r>
-    </w:p>
-    <w:p>
-      <w:r>
-        <w:t>- Iluminación limpia y equilibrada.</w:t>
-      </w:r>
-    </w:p>
-    <w:p>
-      <w:r>
-        <w:t>- Diseño visual atractivo para sitio web.</w:t>
-      </w:r>
-    </w:p>
-    <w:p>
-      <w:r>
-        <w:t>- Aspecto tecnológico, educativo e innovador.</w:t>
-      </w:r>
-    </w:p>
-    <w:p>
-      <w:r>
-        <w:t>- Composición dinámica pero ordenada.</w:t>
+        <w:t>- Máximo 3 a 6 palabras.</w:t>
+      </w:r>
+    </w:p>
+    <w:p>
+      <w:r>
+        <w:t>- Diseño elegante y profesional.</w:t>
+      </w:r>
+    </w:p>
+    <w:p>
+      <w:r>
+        <w:t>- Fácil lectura.</w:t>
+      </w:r>
+    </w:p>
+    <w:p>
+      <w:r>
+        <w:t>- Integrado visualmente en la imagen.</w:t>
+      </w:r>
+    </w:p>
+    <w:p>
+      <w:r>
+        <w:t>- Ubicado en una zona que no oculte elementos importantes.</w:t>
+      </w:r>
+    </w:p>
+    <w:p>
+      <w:r>
+        <w:t>- Color con alto contraste respecto al fondo.</w:t>
+      </w:r>
+    </w:p>
+    <w:p>
+      <w:r>
+        <w:t>- Estilo corporativo e institucional.</w:t>
       </w:r>
     </w:p>
     <w:p/>
     <w:p>
       <w:r>
-        <w:t>TEXTO INTEGRADO:</w:t>
+        <w:t>RESTRICCIONES:</w:t>
       </w:r>
     </w:p>
     <w:p/>
     <w:p>
       <w:r>
-        <w:t>Agregar un único título breve relacionado con el proyecto.</w:t>
+        <w:t>- No agregar logotipos.</w:t>
+      </w:r>
+    </w:p>
+    <w:p>
+      <w:r>
+        <w:t>- No agregar marcas de agua.</w:t>
+      </w:r>
+    </w:p>
+    <w:p>
+      <w:r>
+        <w:t>- No agregar párrafos.</w:t>
+      </w:r>
+    </w:p>
+    <w:p>
+      <w:r>
+        <w:t>- No agregar textos adicionales.</w:t>
+      </w:r>
+    </w:p>
+    <w:p>
+      <w:r>
+        <w:t>- No agregar datos ficticios.</w:t>
+      </w:r>
+    </w:p>
+    <w:p>
+      <w:r>
+        <w:t>- No usar estilo caricatura.</w:t>
+      </w:r>
+    </w:p>
+    <w:p>
+      <w:r>
+        <w:t>- No usar efectos exagerados.</w:t>
+      </w:r>
+    </w:p>
+    <w:p>
+      <w:r>
+        <w:t>- No crear escenas irreales alejadas de las fotografías originales.</w:t>
       </w:r>
     </w:p>
     <w:p/>
     <w:p>
       <w:r>
-        <w:t>Título:</w:t>
-      </w:r>
-    </w:p>
-    <w:p>
-      <w:r>
-        <w:t>"[NOMBRE DEL PROYECTO]"</w:t>
+        <w:t>FORMATO FINAL:</w:t>
       </w:r>
     </w:p>
     <w:p/>
     <w:p>
       <w:r>
-        <w:t>Características del texto:</w:t>
-      </w:r>
-    </w:p>
-    <w:p>
-      <w:r>
-        <w:t>- Máximo 3 a 6 palabras.</w:t>
-      </w:r>
-    </w:p>
-    <w:p>
-      <w:r>
-        <w:t>- Diseño elegante y profesional.</w:t>
-      </w:r>
-    </w:p>
-    <w:p>
-      <w:r>
-        <w:t>- Fácil lectura.</w:t>
-      </w:r>
-    </w:p>
-    <w:p>
-      <w:r>
-        <w:t>- Integrado visualmente en la imagen.</w:t>
-      </w:r>
-    </w:p>
-    <w:p>
-      <w:r>
-        <w:t>- Ubicado en una zona que no oculte elementos importantes.</w:t>
-      </w:r>
-    </w:p>
-    <w:p>
-      <w:r>
-        <w:t>- Color con alto contraste respecto al fondo.</w:t>
-      </w:r>
-    </w:p>
-    <w:p>
-      <w:r>
-        <w:t>- Estilo corporativo e institucional.</w:t>
+        <w:t>- Relación 16:9.</w:t>
+      </w:r>
+    </w:p>
+    <w:p>
+      <w:r>
+        <w:t>- Portada horizontal.</w:t>
+      </w:r>
+    </w:p>
+    <w:p>
+      <w:r>
+        <w:t>- Calidad web profesional.</w:t>
+      </w:r>
+    </w:p>
+    <w:p>
+      <w:r>
+        <w:t>- Preparada para catálogo institucional de proyectos.</w:t>
+      </w:r>
+    </w:p>
+    <w:p>
+      <w:r>
+        <w:t>- Sin bordes ni marcos.</w:t>
       </w:r>
     </w:p>
     <w:p/>
     <w:p>
       <w:r>
-        <w:t>RESTRICCIONES:</w:t>
+        <w:t>RESULTADO ESPERADO:</w:t>
       </w:r>
     </w:p>
     <w:p/>
     <w:p>
       <w:r>
-        <w:t>- No agregar logotipos.</w:t>
-      </w:r>
-    </w:p>
-    <w:p>
-      <w:r>
-        <w:t>- No agregar marcas de agua.</w:t>
-      </w:r>
-    </w:p>
-    <w:p>
-      <w:r>
-        <w:t>- No agregar párrafos.</w:t>
-      </w:r>
-    </w:p>
-    <w:p>
-      <w:r>
-        <w:t>- No agregar textos adicionales.</w:t>
-      </w:r>
-    </w:p>
-    <w:p>
-      <w:r>
         <w:lastRenderedPageBreak/>
-        <w:t>- No agregar datos ficticios.</w:t>
-      </w:r>
-    </w:p>
-    <w:p>
-      <w:r>
-        <w:t>- No usar estilo caricatura.</w:t>
-      </w:r>
-    </w:p>
-    <w:p>
-      <w:r>
-        <w:t>- No usar efectos exagerados.</w:t>
-      </w:r>
-    </w:p>
-    <w:p>
-      <w:r>
-        <w:t>- No crear escenas irreales alejadas de las fotografías originales.</w:t>
-      </w:r>
-    </w:p>
-    <w:p/>
-    <w:p>
-      <w:r>
-        <w:t>FORMATO FINAL:</w:t>
-      </w:r>
-    </w:p>
-    <w:p/>
-    <w:p>
-      <w:r>
-        <w:t>- Relación 16:9.</w:t>
-      </w:r>
-    </w:p>
-    <w:p>
-      <w:r>
-        <w:t>- Portada horizontal.</w:t>
-      </w:r>
-    </w:p>
-    <w:p>
-      <w:r>
-        <w:t>- Calidad web profesional.</w:t>
-      </w:r>
-    </w:p>
-    <w:p>
-      <w:r>
-        <w:t>- Preparada para catálogo institucional de proyectos.</w:t>
-      </w:r>
-    </w:p>
-    <w:p>
-      <w:r>
-        <w:t>- Sin bordes ni marcos.</w:t>
-      </w:r>
-    </w:p>
-    <w:p/>
-    <w:p>
-      <w:r>
-        <w:t>RESULTADO ESPERADO:</w:t>
-      </w:r>
-    </w:p>
-    <w:p/>
-    <w:p>
-      <w:r>
         <w:t>Una imagen de portada única, visualmente impactante y profesional, construida a partir de las fotografías proporcionadas, que comunique claramente el proyecto y contenga únicamente el nombre del proyecto como texto principal.</w:t>
       </w:r>
     </w:p>
@@ -6697,6 +5977,304 @@
     </w:lvl>
   </w:abstractNum>
   <w:abstractNum w:abstractNumId="3" w15:restartNumberingAfterBreak="0">
+    <w:nsid w:val="127670F8"/>
+    <w:multiLevelType w:val="multilevel"/>
+    <w:tmpl w:val="3092C4DE"/>
+    <w:lvl w:ilvl="0">
+      <w:start w:val="1"/>
+      <w:numFmt w:val="bullet"/>
+      <w:lvlText w:val=""/>
+      <w:lvlJc w:val="left"/>
+      <w:pPr>
+        <w:tabs>
+          <w:tab w:val="num" w:pos="720"/>
+        </w:tabs>
+        <w:ind w:left="720" w:hanging="360"/>
+      </w:pPr>
+      <w:rPr>
+        <w:rFonts w:ascii="Symbol" w:hAnsi="Symbol" w:hint="default"/>
+        <w:sz w:val="20"/>
+      </w:rPr>
+    </w:lvl>
+    <w:lvl w:ilvl="1" w:tentative="1">
+      <w:start w:val="1"/>
+      <w:numFmt w:val="bullet"/>
+      <w:lvlText w:val="o"/>
+      <w:lvlJc w:val="left"/>
+      <w:pPr>
+        <w:tabs>
+          <w:tab w:val="num" w:pos="1440"/>
+        </w:tabs>
+        <w:ind w:left="1440" w:hanging="360"/>
+      </w:pPr>
+      <w:rPr>
+        <w:rFonts w:ascii="Courier New" w:hAnsi="Courier New" w:hint="default"/>
+        <w:sz w:val="20"/>
+      </w:rPr>
+    </w:lvl>
+    <w:lvl w:ilvl="2" w:tentative="1">
+      <w:start w:val="1"/>
+      <w:numFmt w:val="bullet"/>
+      <w:lvlText w:val=""/>
+      <w:lvlJc w:val="left"/>
+      <w:pPr>
+        <w:tabs>
+          <w:tab w:val="num" w:pos="2160"/>
+        </w:tabs>
+        <w:ind w:left="2160" w:hanging="360"/>
+      </w:pPr>
+      <w:rPr>
+        <w:rFonts w:ascii="Wingdings" w:hAnsi="Wingdings" w:hint="default"/>
+        <w:sz w:val="20"/>
+      </w:rPr>
+    </w:lvl>
+    <w:lvl w:ilvl="3" w:tentative="1">
+      <w:start w:val="1"/>
+      <w:numFmt w:val="bullet"/>
+      <w:lvlText w:val=""/>
+      <w:lvlJc w:val="left"/>
+      <w:pPr>
+        <w:tabs>
+          <w:tab w:val="num" w:pos="2880"/>
+        </w:tabs>
+        <w:ind w:left="2880" w:hanging="360"/>
+      </w:pPr>
+      <w:rPr>
+        <w:rFonts w:ascii="Wingdings" w:hAnsi="Wingdings" w:hint="default"/>
+        <w:sz w:val="20"/>
+      </w:rPr>
+    </w:lvl>
+    <w:lvl w:ilvl="4" w:tentative="1">
+      <w:start w:val="1"/>
+      <w:numFmt w:val="bullet"/>
+      <w:lvlText w:val=""/>
+      <w:lvlJc w:val="left"/>
+      <w:pPr>
+        <w:tabs>
+          <w:tab w:val="num" w:pos="3600"/>
+        </w:tabs>
+        <w:ind w:left="3600" w:hanging="360"/>
+      </w:pPr>
+      <w:rPr>
+        <w:rFonts w:ascii="Wingdings" w:hAnsi="Wingdings" w:hint="default"/>
+        <w:sz w:val="20"/>
+      </w:rPr>
+    </w:lvl>
+    <w:lvl w:ilvl="5" w:tentative="1">
+      <w:start w:val="1"/>
+      <w:numFmt w:val="bullet"/>
+      <w:lvlText w:val=""/>
+      <w:lvlJc w:val="left"/>
+      <w:pPr>
+        <w:tabs>
+          <w:tab w:val="num" w:pos="4320"/>
+        </w:tabs>
+        <w:ind w:left="4320" w:hanging="360"/>
+      </w:pPr>
+      <w:rPr>
+        <w:rFonts w:ascii="Wingdings" w:hAnsi="Wingdings" w:hint="default"/>
+        <w:sz w:val="20"/>
+      </w:rPr>
+    </w:lvl>
+    <w:lvl w:ilvl="6" w:tentative="1">
+      <w:start w:val="1"/>
+      <w:numFmt w:val="bullet"/>
+      <w:lvlText w:val=""/>
+      <w:lvlJc w:val="left"/>
+      <w:pPr>
+        <w:tabs>
+          <w:tab w:val="num" w:pos="5040"/>
+        </w:tabs>
+        <w:ind w:left="5040" w:hanging="360"/>
+      </w:pPr>
+      <w:rPr>
+        <w:rFonts w:ascii="Wingdings" w:hAnsi="Wingdings" w:hint="default"/>
+        <w:sz w:val="20"/>
+      </w:rPr>
+    </w:lvl>
+    <w:lvl w:ilvl="7" w:tentative="1">
+      <w:start w:val="1"/>
+      <w:numFmt w:val="bullet"/>
+      <w:lvlText w:val=""/>
+      <w:lvlJc w:val="left"/>
+      <w:pPr>
+        <w:tabs>
+          <w:tab w:val="num" w:pos="5760"/>
+        </w:tabs>
+        <w:ind w:left="5760" w:hanging="360"/>
+      </w:pPr>
+      <w:rPr>
+        <w:rFonts w:ascii="Wingdings" w:hAnsi="Wingdings" w:hint="default"/>
+        <w:sz w:val="20"/>
+      </w:rPr>
+    </w:lvl>
+    <w:lvl w:ilvl="8" w:tentative="1">
+      <w:start w:val="1"/>
+      <w:numFmt w:val="bullet"/>
+      <w:lvlText w:val=""/>
+      <w:lvlJc w:val="left"/>
+      <w:pPr>
+        <w:tabs>
+          <w:tab w:val="num" w:pos="6480"/>
+        </w:tabs>
+        <w:ind w:left="6480" w:hanging="360"/>
+      </w:pPr>
+      <w:rPr>
+        <w:rFonts w:ascii="Wingdings" w:hAnsi="Wingdings" w:hint="default"/>
+        <w:sz w:val="20"/>
+      </w:rPr>
+    </w:lvl>
+  </w:abstractNum>
+  <w:abstractNum w:abstractNumId="4" w15:restartNumberingAfterBreak="0">
+    <w:nsid w:val="168B12F5"/>
+    <w:multiLevelType w:val="multilevel"/>
+    <w:tmpl w:val="D48EEA74"/>
+    <w:lvl w:ilvl="0">
+      <w:start w:val="1"/>
+      <w:numFmt w:val="bullet"/>
+      <w:lvlText w:val=""/>
+      <w:lvlJc w:val="left"/>
+      <w:pPr>
+        <w:tabs>
+          <w:tab w:val="num" w:pos="720"/>
+        </w:tabs>
+        <w:ind w:left="720" w:hanging="360"/>
+      </w:pPr>
+      <w:rPr>
+        <w:rFonts w:ascii="Symbol" w:hAnsi="Symbol" w:hint="default"/>
+        <w:sz w:val="20"/>
+      </w:rPr>
+    </w:lvl>
+    <w:lvl w:ilvl="1" w:tentative="1">
+      <w:start w:val="1"/>
+      <w:numFmt w:val="bullet"/>
+      <w:lvlText w:val="o"/>
+      <w:lvlJc w:val="left"/>
+      <w:pPr>
+        <w:tabs>
+          <w:tab w:val="num" w:pos="1440"/>
+        </w:tabs>
+        <w:ind w:left="1440" w:hanging="360"/>
+      </w:pPr>
+      <w:rPr>
+        <w:rFonts w:ascii="Courier New" w:hAnsi="Courier New" w:hint="default"/>
+        <w:sz w:val="20"/>
+      </w:rPr>
+    </w:lvl>
+    <w:lvl w:ilvl="2" w:tentative="1">
+      <w:start w:val="1"/>
+      <w:numFmt w:val="bullet"/>
+      <w:lvlText w:val=""/>
+      <w:lvlJc w:val="left"/>
+      <w:pPr>
+        <w:tabs>
+          <w:tab w:val="num" w:pos="2160"/>
+        </w:tabs>
+        <w:ind w:left="2160" w:hanging="360"/>
+      </w:pPr>
+      <w:rPr>
+        <w:rFonts w:ascii="Wingdings" w:hAnsi="Wingdings" w:hint="default"/>
+        <w:sz w:val="20"/>
+      </w:rPr>
+    </w:lvl>
+    <w:lvl w:ilvl="3" w:tentative="1">
+      <w:start w:val="1"/>
+      <w:numFmt w:val="bullet"/>
+      <w:lvlText w:val=""/>
+      <w:lvlJc w:val="left"/>
+      <w:pPr>
+        <w:tabs>
+          <w:tab w:val="num" w:pos="2880"/>
+        </w:tabs>
+        <w:ind w:left="2880" w:hanging="360"/>
+      </w:pPr>
+      <w:rPr>
+        <w:rFonts w:ascii="Wingdings" w:hAnsi="Wingdings" w:hint="default"/>
+        <w:sz w:val="20"/>
+      </w:rPr>
+    </w:lvl>
+    <w:lvl w:ilvl="4" w:tentative="1">
+      <w:start w:val="1"/>
+      <w:numFmt w:val="bullet"/>
+      <w:lvlText w:val=""/>
+      <w:lvlJc w:val="left"/>
+      <w:pPr>
+        <w:tabs>
+          <w:tab w:val="num" w:pos="3600"/>
+        </w:tabs>
+        <w:ind w:left="3600" w:hanging="360"/>
+      </w:pPr>
+      <w:rPr>
+        <w:rFonts w:ascii="Wingdings" w:hAnsi="Wingdings" w:hint="default"/>
+        <w:sz w:val="20"/>
+      </w:rPr>
+    </w:lvl>
+    <w:lvl w:ilvl="5" w:tentative="1">
+      <w:start w:val="1"/>
+      <w:numFmt w:val="bullet"/>
+      <w:lvlText w:val=""/>
+      <w:lvlJc w:val="left"/>
+      <w:pPr>
+        <w:tabs>
+          <w:tab w:val="num" w:pos="4320"/>
+        </w:tabs>
+        <w:ind w:left="4320" w:hanging="360"/>
+      </w:pPr>
+      <w:rPr>
+        <w:rFonts w:ascii="Wingdings" w:hAnsi="Wingdings" w:hint="default"/>
+        <w:sz w:val="20"/>
+      </w:rPr>
+    </w:lvl>
+    <w:lvl w:ilvl="6" w:tentative="1">
+      <w:start w:val="1"/>
+      <w:numFmt w:val="bullet"/>
+      <w:lvlText w:val=""/>
+      <w:lvlJc w:val="left"/>
+      <w:pPr>
+        <w:tabs>
+          <w:tab w:val="num" w:pos="5040"/>
+        </w:tabs>
+        <w:ind w:left="5040" w:hanging="360"/>
+      </w:pPr>
+      <w:rPr>
+        <w:rFonts w:ascii="Wingdings" w:hAnsi="Wingdings" w:hint="default"/>
+        <w:sz w:val="20"/>
+      </w:rPr>
+    </w:lvl>
+    <w:lvl w:ilvl="7" w:tentative="1">
+      <w:start w:val="1"/>
+      <w:numFmt w:val="bullet"/>
+      <w:lvlText w:val=""/>
+      <w:lvlJc w:val="left"/>
+      <w:pPr>
+        <w:tabs>
+          <w:tab w:val="num" w:pos="5760"/>
+        </w:tabs>
+        <w:ind w:left="5760" w:hanging="360"/>
+      </w:pPr>
+      <w:rPr>
+        <w:rFonts w:ascii="Wingdings" w:hAnsi="Wingdings" w:hint="default"/>
+        <w:sz w:val="20"/>
+      </w:rPr>
+    </w:lvl>
+    <w:lvl w:ilvl="8" w:tentative="1">
+      <w:start w:val="1"/>
+      <w:numFmt w:val="bullet"/>
+      <w:lvlText w:val=""/>
+      <w:lvlJc w:val="left"/>
+      <w:pPr>
+        <w:tabs>
+          <w:tab w:val="num" w:pos="6480"/>
+        </w:tabs>
+        <w:ind w:left="6480" w:hanging="360"/>
+      </w:pPr>
+      <w:rPr>
+        <w:rFonts w:ascii="Wingdings" w:hAnsi="Wingdings" w:hint="default"/>
+        <w:sz w:val="20"/>
+      </w:rPr>
+    </w:lvl>
+  </w:abstractNum>
+  <w:abstractNum w:abstractNumId="5" w15:restartNumberingAfterBreak="0">
     <w:nsid w:val="2247289B"/>
     <w:multiLevelType w:val="multilevel"/>
     <w:tmpl w:val="14705BFC"/>
@@ -6845,7 +6423,156 @@
       </w:rPr>
     </w:lvl>
   </w:abstractNum>
-  <w:abstractNum w:abstractNumId="4" w15:restartNumberingAfterBreak="0">
+  <w:abstractNum w:abstractNumId="6" w15:restartNumberingAfterBreak="0">
+    <w:nsid w:val="24AC0771"/>
+    <w:multiLevelType w:val="multilevel"/>
+    <w:tmpl w:val="6E7ADD16"/>
+    <w:lvl w:ilvl="0">
+      <w:start w:val="1"/>
+      <w:numFmt w:val="bullet"/>
+      <w:lvlText w:val=""/>
+      <w:lvlJc w:val="left"/>
+      <w:pPr>
+        <w:tabs>
+          <w:tab w:val="num" w:pos="720"/>
+        </w:tabs>
+        <w:ind w:left="720" w:hanging="360"/>
+      </w:pPr>
+      <w:rPr>
+        <w:rFonts w:ascii="Symbol" w:hAnsi="Symbol" w:hint="default"/>
+        <w:sz w:val="20"/>
+      </w:rPr>
+    </w:lvl>
+    <w:lvl w:ilvl="1" w:tentative="1">
+      <w:start w:val="1"/>
+      <w:numFmt w:val="bullet"/>
+      <w:lvlText w:val="o"/>
+      <w:lvlJc w:val="left"/>
+      <w:pPr>
+        <w:tabs>
+          <w:tab w:val="num" w:pos="1440"/>
+        </w:tabs>
+        <w:ind w:left="1440" w:hanging="360"/>
+      </w:pPr>
+      <w:rPr>
+        <w:rFonts w:ascii="Courier New" w:hAnsi="Courier New" w:hint="default"/>
+        <w:sz w:val="20"/>
+      </w:rPr>
+    </w:lvl>
+    <w:lvl w:ilvl="2" w:tentative="1">
+      <w:start w:val="1"/>
+      <w:numFmt w:val="bullet"/>
+      <w:lvlText w:val=""/>
+      <w:lvlJc w:val="left"/>
+      <w:pPr>
+        <w:tabs>
+          <w:tab w:val="num" w:pos="2160"/>
+        </w:tabs>
+        <w:ind w:left="2160" w:hanging="360"/>
+      </w:pPr>
+      <w:rPr>
+        <w:rFonts w:ascii="Wingdings" w:hAnsi="Wingdings" w:hint="default"/>
+        <w:sz w:val="20"/>
+      </w:rPr>
+    </w:lvl>
+    <w:lvl w:ilvl="3" w:tentative="1">
+      <w:start w:val="1"/>
+      <w:numFmt w:val="bullet"/>
+      <w:lvlText w:val=""/>
+      <w:lvlJc w:val="left"/>
+      <w:pPr>
+        <w:tabs>
+          <w:tab w:val="num" w:pos="2880"/>
+        </w:tabs>
+        <w:ind w:left="2880" w:hanging="360"/>
+      </w:pPr>
+      <w:rPr>
+        <w:rFonts w:ascii="Wingdings" w:hAnsi="Wingdings" w:hint="default"/>
+        <w:sz w:val="20"/>
+      </w:rPr>
+    </w:lvl>
+    <w:lvl w:ilvl="4" w:tentative="1">
+      <w:start w:val="1"/>
+      <w:numFmt w:val="bullet"/>
+      <w:lvlText w:val=""/>
+      <w:lvlJc w:val="left"/>
+      <w:pPr>
+        <w:tabs>
+          <w:tab w:val="num" w:pos="3600"/>
+        </w:tabs>
+        <w:ind w:left="3600" w:hanging="360"/>
+      </w:pPr>
+      <w:rPr>
+        <w:rFonts w:ascii="Wingdings" w:hAnsi="Wingdings" w:hint="default"/>
+        <w:sz w:val="20"/>
+      </w:rPr>
+    </w:lvl>
+    <w:lvl w:ilvl="5" w:tentative="1">
+      <w:start w:val="1"/>
+      <w:numFmt w:val="bullet"/>
+      <w:lvlText w:val=""/>
+      <w:lvlJc w:val="left"/>
+      <w:pPr>
+        <w:tabs>
+          <w:tab w:val="num" w:pos="4320"/>
+        </w:tabs>
+        <w:ind w:left="4320" w:hanging="360"/>
+      </w:pPr>
+      <w:rPr>
+        <w:rFonts w:ascii="Wingdings" w:hAnsi="Wingdings" w:hint="default"/>
+        <w:sz w:val="20"/>
+      </w:rPr>
+    </w:lvl>
+    <w:lvl w:ilvl="6" w:tentative="1">
+      <w:start w:val="1"/>
+      <w:numFmt w:val="bullet"/>
+      <w:lvlText w:val=""/>
+      <w:lvlJc w:val="left"/>
+      <w:pPr>
+        <w:tabs>
+          <w:tab w:val="num" w:pos="5040"/>
+        </w:tabs>
+        <w:ind w:left="5040" w:hanging="360"/>
+      </w:pPr>
+      <w:rPr>
+        <w:rFonts w:ascii="Wingdings" w:hAnsi="Wingdings" w:hint="default"/>
+        <w:sz w:val="20"/>
+      </w:rPr>
+    </w:lvl>
+    <w:lvl w:ilvl="7" w:tentative="1">
+      <w:start w:val="1"/>
+      <w:numFmt w:val="bullet"/>
+      <w:lvlText w:val=""/>
+      <w:lvlJc w:val="left"/>
+      <w:pPr>
+        <w:tabs>
+          <w:tab w:val="num" w:pos="5760"/>
+        </w:tabs>
+        <w:ind w:left="5760" w:hanging="360"/>
+      </w:pPr>
+      <w:rPr>
+        <w:rFonts w:ascii="Wingdings" w:hAnsi="Wingdings" w:hint="default"/>
+        <w:sz w:val="20"/>
+      </w:rPr>
+    </w:lvl>
+    <w:lvl w:ilvl="8" w:tentative="1">
+      <w:start w:val="1"/>
+      <w:numFmt w:val="bullet"/>
+      <w:lvlText w:val=""/>
+      <w:lvlJc w:val="left"/>
+      <w:pPr>
+        <w:tabs>
+          <w:tab w:val="num" w:pos="6480"/>
+        </w:tabs>
+        <w:ind w:left="6480" w:hanging="360"/>
+      </w:pPr>
+      <w:rPr>
+        <w:rFonts w:ascii="Wingdings" w:hAnsi="Wingdings" w:hint="default"/>
+        <w:sz w:val="20"/>
+      </w:rPr>
+    </w:lvl>
+  </w:abstractNum>
+  <w:abstractNum w:abstractNumId="7" w15:restartNumberingAfterBreak="0">
     <w:nsid w:val="2B6F6E54"/>
     <w:multiLevelType w:val="multilevel"/>
     <w:tmpl w:val="B5F65124"/>
@@ -6994,7 +6721,7 @@
       </w:rPr>
     </w:lvl>
   </w:abstractNum>
-  <w:abstractNum w:abstractNumId="5" w15:restartNumberingAfterBreak="0">
+  <w:abstractNum w:abstractNumId="8" w15:restartNumberingAfterBreak="0">
     <w:nsid w:val="34B70A2F"/>
     <w:multiLevelType w:val="multilevel"/>
     <w:tmpl w:val="9F2012D2"/>
@@ -7143,7 +6870,7 @@
       </w:rPr>
     </w:lvl>
   </w:abstractNum>
-  <w:abstractNum w:abstractNumId="6" w15:restartNumberingAfterBreak="0">
+  <w:abstractNum w:abstractNumId="9" w15:restartNumberingAfterBreak="0">
     <w:nsid w:val="38A43007"/>
     <w:multiLevelType w:val="multilevel"/>
     <w:tmpl w:val="737A86E0"/>
@@ -7292,7 +7019,7 @@
       </w:rPr>
     </w:lvl>
   </w:abstractNum>
-  <w:abstractNum w:abstractNumId="7" w15:restartNumberingAfterBreak="0">
+  <w:abstractNum w:abstractNumId="10" w15:restartNumberingAfterBreak="0">
     <w:nsid w:val="39D71DDC"/>
     <w:multiLevelType w:val="multilevel"/>
     <w:tmpl w:val="910C174A"/>
@@ -7441,7 +7168,7 @@
       </w:rPr>
     </w:lvl>
   </w:abstractNum>
-  <w:abstractNum w:abstractNumId="8" w15:restartNumberingAfterBreak="0">
+  <w:abstractNum w:abstractNumId="11" w15:restartNumberingAfterBreak="0">
     <w:nsid w:val="3B5033B3"/>
     <w:multiLevelType w:val="multilevel"/>
     <w:tmpl w:val="2F54F656"/>
@@ -7590,7 +7317,7 @@
       </w:rPr>
     </w:lvl>
   </w:abstractNum>
-  <w:abstractNum w:abstractNumId="9" w15:restartNumberingAfterBreak="0">
+  <w:abstractNum w:abstractNumId="12" w15:restartNumberingAfterBreak="0">
     <w:nsid w:val="623D02AD"/>
     <w:multiLevelType w:val="multilevel"/>
     <w:tmpl w:val="CB9A8082"/>
@@ -7739,7 +7466,7 @@
       </w:rPr>
     </w:lvl>
   </w:abstractNum>
-  <w:abstractNum w:abstractNumId="10" w15:restartNumberingAfterBreak="0">
+  <w:abstractNum w:abstractNumId="13" w15:restartNumberingAfterBreak="0">
     <w:nsid w:val="6DC03F58"/>
     <w:multiLevelType w:val="multilevel"/>
     <w:tmpl w:val="88605EA8"/>
@@ -7888,7 +7615,7 @@
       </w:rPr>
     </w:lvl>
   </w:abstractNum>
-  <w:abstractNum w:abstractNumId="11" w15:restartNumberingAfterBreak="0">
+  <w:abstractNum w:abstractNumId="14" w15:restartNumberingAfterBreak="0">
     <w:nsid w:val="75EC3884"/>
     <w:multiLevelType w:val="multilevel"/>
     <w:tmpl w:val="DF72D36A"/>
@@ -8037,7 +7764,7 @@
       </w:rPr>
     </w:lvl>
   </w:abstractNum>
-  <w:abstractNum w:abstractNumId="12" w15:restartNumberingAfterBreak="0">
+  <w:abstractNum w:abstractNumId="15" w15:restartNumberingAfterBreak="0">
     <w:nsid w:val="7FC45E47"/>
     <w:multiLevelType w:val="multilevel"/>
     <w:tmpl w:val="0EE6115C"/>
@@ -8187,43 +7914,52 @@
     </w:lvl>
   </w:abstractNum>
   <w:num w:numId="1" w16cid:durableId="637153068">
-    <w:abstractNumId w:val="4"/>
+    <w:abstractNumId w:val="7"/>
   </w:num>
   <w:num w:numId="2" w16cid:durableId="1010715340">
-    <w:abstractNumId w:val="9"/>
+    <w:abstractNumId w:val="12"/>
   </w:num>
   <w:num w:numId="3" w16cid:durableId="1924299206">
-    <w:abstractNumId w:val="7"/>
+    <w:abstractNumId w:val="10"/>
   </w:num>
   <w:num w:numId="4" w16cid:durableId="1460565336">
-    <w:abstractNumId w:val="10"/>
+    <w:abstractNumId w:val="13"/>
   </w:num>
   <w:num w:numId="5" w16cid:durableId="820001258">
     <w:abstractNumId w:val="2"/>
   </w:num>
   <w:num w:numId="6" w16cid:durableId="322438110">
+    <w:abstractNumId w:val="14"/>
+  </w:num>
+  <w:num w:numId="7" w16cid:durableId="548733407">
+    <w:abstractNumId w:val="15"/>
+  </w:num>
+  <w:num w:numId="8" w16cid:durableId="1975522272">
     <w:abstractNumId w:val="11"/>
   </w:num>
-  <w:num w:numId="7" w16cid:durableId="548733407">
-    <w:abstractNumId w:val="12"/>
-  </w:num>
-  <w:num w:numId="8" w16cid:durableId="1975522272">
-    <w:abstractNumId w:val="8"/>
-  </w:num>
   <w:num w:numId="9" w16cid:durableId="694112053">
-    <w:abstractNumId w:val="3"/>
+    <w:abstractNumId w:val="5"/>
   </w:num>
   <w:num w:numId="10" w16cid:durableId="1767538673">
-    <w:abstractNumId w:val="6"/>
+    <w:abstractNumId w:val="9"/>
   </w:num>
   <w:num w:numId="11" w16cid:durableId="1627468827">
     <w:abstractNumId w:val="1"/>
   </w:num>
   <w:num w:numId="12" w16cid:durableId="673218071">
-    <w:abstractNumId w:val="5"/>
+    <w:abstractNumId w:val="8"/>
   </w:num>
   <w:num w:numId="13" w16cid:durableId="923303837">
     <w:abstractNumId w:val="0"/>
+  </w:num>
+  <w:num w:numId="14" w16cid:durableId="624654861">
+    <w:abstractNumId w:val="6"/>
+  </w:num>
+  <w:num w:numId="15" w16cid:durableId="1978104133">
+    <w:abstractNumId w:val="3"/>
+  </w:num>
+  <w:num w:numId="16" w16cid:durableId="293221488">
+    <w:abstractNumId w:val="4"/>
   </w:num>
 </w:numbering>
 </file>

</xml_diff>